<commit_message>
Entrega de evidencias individuales resueltas - Jean Garcia
</commit_message>
<xml_diff>
--- a/FASE 1/Evidencias Individuales/GARCIA_JEAN_1.2_APT122_DiarioReflexionFase1.docx
+++ b/FASE 1/Evidencias Individuales/GARCIA_JEAN_1.2_APT122_DiarioReflexionFase1.docx
@@ -1,6 +1,6 @@
 
 <file path=word/document.xml><?xml version="1.0" encoding="utf-8"?>
-<w:document xmlns:wpc="http://schemas.microsoft.com/office/word/2010/wordprocessingCanvas" xmlns:cx="http://schemas.microsoft.com/office/drawing/2014/chartex" xmlns:mc="http://schemas.openxmlformats.org/markup-compatibility/2006" xmlns:o="urn:schemas-microsoft-com:office:office" xmlns:r="http://schemas.openxmlformats.org/officeDocument/2006/relationships" xmlns:m="http://schemas.openxmlformats.org/officeDocument/2006/math" xmlns:v="urn:schemas-microsoft-com:vml" xmlns:wp14="http://schemas.microsoft.com/office/word/2010/wordprocessingDrawing" xmlns:wp="http://schemas.openxmlformats.org/drawingml/2006/wordprocessingDrawing" xmlns:w10="urn:schemas-microsoft-com:office:word" xmlns:w="http://schemas.openxmlformats.org/wordprocessingml/2006/main" xmlns:w14="http://schemas.microsoft.com/office/word/2010/wordml" xmlns:w15="http://schemas.microsoft.com/office/word/2012/wordml" xmlns:w16se="http://schemas.microsoft.com/office/word/2015/wordml/symex" xmlns:wpg="http://schemas.microsoft.com/office/word/2010/wordprocessingGroup" xmlns:wpi="http://schemas.microsoft.com/office/word/2010/wordprocessingInk" xmlns:wne="http://schemas.microsoft.com/office/word/2006/wordml" xmlns:wps="http://schemas.microsoft.com/office/word/2010/wordprocessingShape" mc:Ignorable="w14 w15 w16se wp14">
+<w:document xmlns:wpc="http://schemas.microsoft.com/office/word/2010/wordprocessingCanvas" xmlns:cx="http://schemas.microsoft.com/office/drawing/2014/chartex" xmlns:cx1="http://schemas.microsoft.com/office/drawing/2015/9/8/chartex" xmlns:mc="http://schemas.openxmlformats.org/markup-compatibility/2006" xmlns:o="urn:schemas-microsoft-com:office:office" xmlns:r="http://schemas.openxmlformats.org/officeDocument/2006/relationships" xmlns:m="http://schemas.openxmlformats.org/officeDocument/2006/math" xmlns:v="urn:schemas-microsoft-com:vml" xmlns:wp14="http://schemas.microsoft.com/office/word/2010/wordprocessingDrawing" xmlns:wp="http://schemas.openxmlformats.org/drawingml/2006/wordprocessingDrawing" xmlns:w10="urn:schemas-microsoft-com:office:word" xmlns:w="http://schemas.openxmlformats.org/wordprocessingml/2006/main" xmlns:w14="http://schemas.microsoft.com/office/word/2010/wordml" xmlns:w15="http://schemas.microsoft.com/office/word/2012/wordml" xmlns:w16se="http://schemas.microsoft.com/office/word/2015/wordml/symex" xmlns:wpg="http://schemas.microsoft.com/office/word/2010/wordprocessingGroup" xmlns:wpi="http://schemas.microsoft.com/office/word/2010/wordprocessingInk" xmlns:wne="http://schemas.microsoft.com/office/word/2006/wordml" xmlns:wps="http://schemas.microsoft.com/office/word/2010/wordprocessingShape" mc:Ignorable="w14 w15 w16se wp14">
   <w:body>
     <w:p/>
     <w:tbl>
@@ -369,6 +369,210 @@
                 <w:szCs w:val="24"/>
               </w:rPr>
             </w:pPr>
+            <w:r>
+              <w:rPr>
+                <w:rFonts w:eastAsiaTheme="majorEastAsia"/>
+                <w:color w:val="767171" w:themeColor="background2" w:themeShade="80"/>
+                <w:sz w:val="24"/>
+                <w:szCs w:val="24"/>
+              </w:rPr>
+              <w:t>Las asignaturas que más me han gustado durante mi carrera son aquellas relacionadas con el desarrollo de software, bases de datos, análisis de información y desarrollo de soluciones tecnológicas.</w:t>
+            </w:r>
+          </w:p>
+          <w:p>
+            <w:pPr>
+              <w:rPr>
+                <w:rFonts w:eastAsiaTheme="majorEastAsia"/>
+                <w:color w:val="767171" w:themeColor="background2" w:themeShade="80"/>
+                <w:sz w:val="24"/>
+                <w:szCs w:val="24"/>
+              </w:rPr>
+            </w:pPr>
+          </w:p>
+          <w:p>
+            <w:pPr>
+              <w:rPr>
+                <w:rFonts w:eastAsiaTheme="majorEastAsia"/>
+                <w:color w:val="767171" w:themeColor="background2" w:themeShade="80"/>
+                <w:sz w:val="24"/>
+                <w:szCs w:val="24"/>
+              </w:rPr>
+            </w:pPr>
+            <w:r>
+              <w:rPr>
+                <w:rFonts w:eastAsiaTheme="majorEastAsia"/>
+                <w:color w:val="767171" w:themeColor="background2" w:themeShade="80"/>
+                <w:sz w:val="24"/>
+                <w:szCs w:val="24"/>
+              </w:rPr>
+              <w:t>Una de las asignaturas que más me interesó fue Desarrollo de Aplicaciones Móviles, ya que me permitió crear aplicaciones y comprender cómo una solución tecnológica puede responder a una necesidad concreta. Me gustó especialmente trabajar con Android Studio, programación y almacenamiento de información.</w:t>
+            </w:r>
+          </w:p>
+          <w:p>
+            <w:pPr>
+              <w:rPr>
+                <w:rFonts w:eastAsiaTheme="majorEastAsia"/>
+                <w:color w:val="767171" w:themeColor="background2" w:themeShade="80"/>
+                <w:sz w:val="24"/>
+                <w:szCs w:val="24"/>
+              </w:rPr>
+            </w:pPr>
+          </w:p>
+          <w:p>
+            <w:pPr>
+              <w:rPr>
+                <w:rFonts w:eastAsiaTheme="majorEastAsia"/>
+                <w:color w:val="767171" w:themeColor="background2" w:themeShade="80"/>
+                <w:sz w:val="24"/>
+                <w:szCs w:val="24"/>
+              </w:rPr>
+            </w:pPr>
+            <w:r>
+              <w:rPr>
+                <w:rFonts w:eastAsiaTheme="majorEastAsia"/>
+                <w:color w:val="767171" w:themeColor="background2" w:themeShade="80"/>
+                <w:sz w:val="24"/>
+                <w:szCs w:val="24"/>
+              </w:rPr>
+              <w:t>También me interesaron asignaturas como Desarrollo Orientado a Objetos, porque me permitió fortalecer mis conocimientos de programación y aprender a estructurar mejor las soluciones de software.</w:t>
+            </w:r>
+          </w:p>
+          <w:p>
+            <w:pPr>
+              <w:rPr>
+                <w:rFonts w:eastAsiaTheme="majorEastAsia"/>
+                <w:color w:val="767171" w:themeColor="background2" w:themeShade="80"/>
+                <w:sz w:val="24"/>
+                <w:szCs w:val="24"/>
+              </w:rPr>
+            </w:pPr>
+          </w:p>
+          <w:p>
+            <w:pPr>
+              <w:rPr>
+                <w:rFonts w:eastAsiaTheme="majorEastAsia"/>
+                <w:color w:val="767171" w:themeColor="background2" w:themeShade="80"/>
+                <w:sz w:val="24"/>
+                <w:szCs w:val="24"/>
+              </w:rPr>
+            </w:pPr>
+            <w:r>
+              <w:rPr>
+                <w:rFonts w:eastAsiaTheme="majorEastAsia"/>
+                <w:color w:val="767171" w:themeColor="background2" w:themeShade="80"/>
+                <w:sz w:val="24"/>
+                <w:szCs w:val="24"/>
+              </w:rPr>
+              <w:t>Otra área que me llamó la atención fue Big Data y Minería de Datos, debido a que permite trabajar con grandes cantidades de información y obtener conocimientos útiles para la toma de decisiones. Me gustó trabajar con datos reales, procesos de análisis y herramientas tecnológicas.</w:t>
+            </w:r>
+          </w:p>
+          <w:p>
+            <w:pPr>
+              <w:rPr>
+                <w:rFonts w:eastAsiaTheme="majorEastAsia"/>
+                <w:color w:val="767171" w:themeColor="background2" w:themeShade="80"/>
+                <w:sz w:val="24"/>
+                <w:szCs w:val="24"/>
+              </w:rPr>
+            </w:pPr>
+          </w:p>
+          <w:p>
+            <w:pPr>
+              <w:rPr>
+                <w:rFonts w:eastAsiaTheme="majorEastAsia"/>
+                <w:color w:val="767171" w:themeColor="background2" w:themeShade="80"/>
+                <w:sz w:val="24"/>
+                <w:szCs w:val="24"/>
+              </w:rPr>
+            </w:pPr>
+            <w:r>
+              <w:rPr>
+                <w:rFonts w:eastAsiaTheme="majorEastAsia"/>
+                <w:color w:val="767171" w:themeColor="background2" w:themeShade="80"/>
+                <w:sz w:val="24"/>
+                <w:szCs w:val="24"/>
+              </w:rPr>
+              <w:t xml:space="preserve">También considero interesante Deep </w:t>
+            </w:r>
+            <w:proofErr w:type="spellStart"/>
+            <w:r>
+              <w:rPr>
+                <w:rFonts w:eastAsiaTheme="majorEastAsia"/>
+                <w:color w:val="767171" w:themeColor="background2" w:themeShade="80"/>
+                <w:sz w:val="24"/>
+                <w:szCs w:val="24"/>
+              </w:rPr>
+              <w:t>Learning</w:t>
+            </w:r>
+            <w:proofErr w:type="spellEnd"/>
+            <w:r>
+              <w:rPr>
+                <w:rFonts w:eastAsiaTheme="majorEastAsia"/>
+                <w:color w:val="767171" w:themeColor="background2" w:themeShade="80"/>
+                <w:sz w:val="24"/>
+                <w:szCs w:val="24"/>
+              </w:rPr>
+              <w:t>, ya que permitió conocer aplicaciones más avanzadas de la inteligencia artificial y comprender cómo estas tecnologías pueden utilizarse para resolver problemas.</w:t>
+            </w:r>
+          </w:p>
+          <w:p>
+            <w:pPr>
+              <w:rPr>
+                <w:rFonts w:eastAsiaTheme="majorEastAsia"/>
+                <w:color w:val="767171" w:themeColor="background2" w:themeShade="80"/>
+                <w:sz w:val="24"/>
+                <w:szCs w:val="24"/>
+              </w:rPr>
+            </w:pPr>
+          </w:p>
+          <w:p>
+            <w:pPr>
+              <w:rPr>
+                <w:rFonts w:eastAsiaTheme="majorEastAsia"/>
+                <w:color w:val="767171" w:themeColor="background2" w:themeShade="80"/>
+                <w:sz w:val="24"/>
+                <w:szCs w:val="24"/>
+              </w:rPr>
+            </w:pPr>
+            <w:r>
+              <w:rPr>
+                <w:rFonts w:eastAsiaTheme="majorEastAsia"/>
+                <w:color w:val="767171" w:themeColor="background2" w:themeShade="80"/>
+                <w:sz w:val="24"/>
+                <w:szCs w:val="24"/>
+              </w:rPr>
+              <w:lastRenderedPageBreak/>
+              <w:t>Finalmente, asignaturas relacionadas con la gestión y modelamiento de procesos también han sido importantes, porque permiten comprender que un sistema informático no solamente debe funcionar técnicamente, sino que debe responder a las necesidades de una organización.</w:t>
+            </w:r>
+          </w:p>
+          <w:p>
+            <w:pPr>
+              <w:rPr>
+                <w:rFonts w:eastAsiaTheme="majorEastAsia"/>
+                <w:color w:val="767171" w:themeColor="background2" w:themeShade="80"/>
+                <w:sz w:val="24"/>
+                <w:szCs w:val="24"/>
+              </w:rPr>
+            </w:pPr>
+          </w:p>
+          <w:p>
+            <w:pPr>
+              <w:rPr>
+                <w:rFonts w:eastAsiaTheme="majorEastAsia"/>
+                <w:color w:val="767171" w:themeColor="background2" w:themeShade="80"/>
+                <w:sz w:val="24"/>
+                <w:szCs w:val="24"/>
+              </w:rPr>
+            </w:pPr>
+            <w:r>
+              <w:rPr>
+                <w:rFonts w:eastAsiaTheme="majorEastAsia"/>
+                <w:color w:val="767171" w:themeColor="background2" w:themeShade="80"/>
+                <w:sz w:val="24"/>
+                <w:szCs w:val="24"/>
+              </w:rPr>
+              <w:t>En general, mis principales intereses se encuentran en el desarrollo de software, análisis de requerimientos, diseño de soluciones informáticas y creación de sistemas que permitan mejorar procesos reales.</w:t>
+            </w:r>
           </w:p>
           <w:p>
             <w:pPr>
@@ -451,6 +655,73 @@
                 <w:szCs w:val="24"/>
               </w:rPr>
             </w:pPr>
+            <w:r>
+              <w:rPr>
+                <w:rFonts w:eastAsiaTheme="majorEastAsia"/>
+                <w:color w:val="767171" w:themeColor="background2" w:themeShade="80"/>
+                <w:sz w:val="24"/>
+                <w:szCs w:val="24"/>
+              </w:rPr>
+              <w:t>Sí, considero que las certificaciones tienen valor porque permiten demostrar los conocimientos y competencias desarrolladas durante la carrera. Además de complementar la formación académica, pueden ser útiles al momento de buscar oportunidades laborales, ya que permiten acreditar conocimientos en determinadas áreas.</w:t>
+            </w:r>
+          </w:p>
+          <w:p>
+            <w:pPr>
+              <w:rPr>
+                <w:rFonts w:eastAsiaTheme="majorEastAsia"/>
+                <w:color w:val="767171" w:themeColor="background2" w:themeShade="80"/>
+                <w:sz w:val="24"/>
+                <w:szCs w:val="24"/>
+              </w:rPr>
+            </w:pPr>
+          </w:p>
+          <w:p>
+            <w:pPr>
+              <w:rPr>
+                <w:rFonts w:eastAsiaTheme="majorEastAsia"/>
+                <w:color w:val="767171" w:themeColor="background2" w:themeShade="80"/>
+                <w:sz w:val="24"/>
+                <w:szCs w:val="24"/>
+              </w:rPr>
+            </w:pPr>
+            <w:r>
+              <w:rPr>
+                <w:rFonts w:eastAsiaTheme="majorEastAsia"/>
+                <w:color w:val="767171" w:themeColor="background2" w:themeShade="80"/>
+                <w:sz w:val="24"/>
+                <w:szCs w:val="24"/>
+              </w:rPr>
+              <w:t>También considero que las certificaciones representan una evidencia del aprendizaje obtenido durante la carrera y ayudan a identificar las áreas en las que cada estudiante posee mayores fortalezas.</w:t>
+            </w:r>
+          </w:p>
+          <w:p>
+            <w:pPr>
+              <w:rPr>
+                <w:rFonts w:eastAsiaTheme="majorEastAsia"/>
+                <w:color w:val="767171" w:themeColor="background2" w:themeShade="80"/>
+                <w:sz w:val="24"/>
+                <w:szCs w:val="24"/>
+              </w:rPr>
+            </w:pPr>
+          </w:p>
+          <w:p>
+            <w:pPr>
+              <w:rPr>
+                <w:rFonts w:eastAsiaTheme="majorEastAsia"/>
+                <w:color w:val="767171" w:themeColor="background2" w:themeShade="80"/>
+                <w:sz w:val="24"/>
+                <w:szCs w:val="24"/>
+              </w:rPr>
+            </w:pPr>
+            <w:r>
+              <w:rPr>
+                <w:rFonts w:eastAsiaTheme="majorEastAsia"/>
+                <w:color w:val="767171" w:themeColor="background2" w:themeShade="80"/>
+                <w:sz w:val="24"/>
+                <w:szCs w:val="24"/>
+              </w:rPr>
+              <w:t>En mi caso, considero especialmente valioso haber desarrollado competencias relacionadas con programación, desarrollo de software, bases de datos, análisis de información y herramientas tecnológicas, ya que son conocimientos que puedo aplicar directamente en proyectos como CITT Stock.</w:t>
+            </w:r>
           </w:p>
           <w:p>
             <w:pPr>
@@ -548,6 +819,30 @@
           <w:sz w:val="24"/>
           <w:szCs w:val="24"/>
           <w:lang w:eastAsia="ja-JP"/>
+        </w:rPr>
+      </w:pPr>
+    </w:p>
+    <w:p>
+      <w:pPr>
+        <w:spacing w:after="0" w:line="360" w:lineRule="auto"/>
+        <w:jc w:val="both"/>
+        <w:rPr>
+          <w:b/>
+          <w:bCs/>
+          <w:sz w:val="24"/>
+          <w:szCs w:val="24"/>
+        </w:rPr>
+      </w:pPr>
+    </w:p>
+    <w:p>
+      <w:pPr>
+        <w:spacing w:after="0" w:line="360" w:lineRule="auto"/>
+        <w:jc w:val="both"/>
+        <w:rPr>
+          <w:b/>
+          <w:bCs/>
+          <w:sz w:val="24"/>
+          <w:szCs w:val="24"/>
         </w:rPr>
       </w:pPr>
     </w:p>
@@ -649,7 +944,7 @@
                 <w:rFonts w:eastAsiaTheme="majorEastAsia"/>
                 <w:b/>
                 <w:bCs/>
-                <w:color w:val="385623" w:themeColor="accent6" w:themeShade="80"/>
+                <w:color w:val="00B050"/>
                 <w:sz w:val="24"/>
                 <w:szCs w:val="24"/>
               </w:rPr>
@@ -658,7 +953,7 @@
             <w:r>
               <w:rPr>
                 <w:rFonts w:eastAsiaTheme="majorEastAsia"/>
-                <w:color w:val="385623" w:themeColor="accent6" w:themeShade="80"/>
+                <w:color w:val="00B050"/>
                 <w:sz w:val="24"/>
                 <w:szCs w:val="24"/>
               </w:rPr>
@@ -773,6 +1068,205 @@
           </w:p>
           <w:p>
             <w:pPr>
+              <w:rPr>
+                <w:rFonts w:eastAsiaTheme="majorEastAsia"/>
+                <w:color w:val="00B050"/>
+                <w:sz w:val="24"/>
+                <w:szCs w:val="24"/>
+              </w:rPr>
+            </w:pPr>
+            <w:r>
+              <w:rPr>
+                <w:rFonts w:eastAsiaTheme="majorEastAsia"/>
+                <w:color w:val="767171" w:themeColor="background2" w:themeShade="80"/>
+                <w:sz w:val="24"/>
+                <w:szCs w:val="24"/>
+              </w:rPr>
+              <w:t xml:space="preserve">Durante mi formación en Ingeniería en Informática considero que mis principales fortalezas se encuentran en el </w:t>
+            </w:r>
+            <w:r>
+              <w:rPr>
+                <w:rFonts w:eastAsiaTheme="majorEastAsia"/>
+                <w:color w:val="00B050"/>
+                <w:sz w:val="24"/>
+                <w:szCs w:val="24"/>
+              </w:rPr>
+              <w:t>desarrollo de soluciones informáticas, utilización de herramientas tecnológicas, trabajo colaborativo y análisis de problemas</w:t>
+            </w:r>
+            <w:r>
+              <w:rPr>
+                <w:rFonts w:eastAsiaTheme="majorEastAsia"/>
+                <w:color w:val="00B050"/>
+                <w:sz w:val="24"/>
+                <w:szCs w:val="24"/>
+              </w:rPr>
+              <w:t>.</w:t>
+            </w:r>
+          </w:p>
+          <w:p>
+            <w:pPr>
+              <w:rPr>
+                <w:rFonts w:eastAsiaTheme="majorEastAsia"/>
+                <w:color w:val="767171" w:themeColor="background2" w:themeShade="80"/>
+                <w:sz w:val="24"/>
+                <w:szCs w:val="24"/>
+              </w:rPr>
+            </w:pPr>
+          </w:p>
+          <w:p>
+            <w:pPr>
+              <w:rPr>
+                <w:rFonts w:eastAsiaTheme="majorEastAsia"/>
+                <w:color w:val="767171" w:themeColor="background2" w:themeShade="80"/>
+                <w:sz w:val="24"/>
+                <w:szCs w:val="24"/>
+              </w:rPr>
+            </w:pPr>
+            <w:r>
+              <w:rPr>
+                <w:rFonts w:eastAsiaTheme="majorEastAsia"/>
+                <w:color w:val="767171" w:themeColor="background2" w:themeShade="80"/>
+                <w:sz w:val="24"/>
+                <w:szCs w:val="24"/>
+              </w:rPr>
+              <w:t>Me siento relativamente seguro trabajando con herramientas de desarrollo, repositorios como GitHub y tecnologías utilizadas durante la carrera. También considero que he desarrollado una buena capacidad para aprender nuevas herramientas cuando un proyecto lo requiere.</w:t>
+            </w:r>
+          </w:p>
+          <w:p>
+            <w:pPr>
+              <w:rPr>
+                <w:rFonts w:eastAsiaTheme="majorEastAsia"/>
+                <w:color w:val="767171" w:themeColor="background2" w:themeShade="80"/>
+                <w:sz w:val="24"/>
+                <w:szCs w:val="24"/>
+              </w:rPr>
+            </w:pPr>
+            <w:r>
+              <w:rPr>
+                <w:rFonts w:eastAsiaTheme="majorEastAsia"/>
+                <w:color w:val="767171" w:themeColor="background2" w:themeShade="80"/>
+                <w:sz w:val="24"/>
+                <w:szCs w:val="24"/>
+              </w:rPr>
+              <w:t>Otra fortaleza es el trabajo en equipo, ya que durante la carrera he participado en diferentes proyectos grupales, donde ha sido necesario distribuir tareas, coordinar avances y resolver problemas en conjunto.</w:t>
+            </w:r>
+          </w:p>
+          <w:p>
+            <w:pPr>
+              <w:rPr>
+                <w:rFonts w:eastAsiaTheme="majorEastAsia"/>
+                <w:color w:val="767171" w:themeColor="background2" w:themeShade="80"/>
+                <w:sz w:val="24"/>
+                <w:szCs w:val="24"/>
+              </w:rPr>
+            </w:pPr>
+          </w:p>
+          <w:p>
+            <w:pPr>
+              <w:rPr>
+                <w:rFonts w:eastAsiaTheme="majorEastAsia"/>
+                <w:color w:val="FF0000"/>
+                <w:sz w:val="24"/>
+                <w:szCs w:val="24"/>
+              </w:rPr>
+            </w:pPr>
+            <w:r>
+              <w:rPr>
+                <w:rFonts w:eastAsiaTheme="majorEastAsia"/>
+                <w:color w:val="767171" w:themeColor="background2" w:themeShade="80"/>
+                <w:sz w:val="24"/>
+                <w:szCs w:val="24"/>
+              </w:rPr>
+              <w:t xml:space="preserve">Como oportunidades de mejora, considero que debo seguir fortaleciendo principalmente la </w:t>
+            </w:r>
+            <w:r>
+              <w:rPr>
+                <w:rFonts w:eastAsiaTheme="majorEastAsia"/>
+                <w:color w:val="FF0000"/>
+                <w:sz w:val="24"/>
+                <w:szCs w:val="24"/>
+              </w:rPr>
+              <w:t>experiencia en proyectos reales, levantamiento y validación de requerimientos con clientes, despliegue de aplicaciones y gestión de proyectos de mayor complejidad</w:t>
+            </w:r>
+            <w:r>
+              <w:rPr>
+                <w:rFonts w:eastAsiaTheme="majorEastAsia"/>
+                <w:color w:val="FF0000"/>
+                <w:sz w:val="24"/>
+                <w:szCs w:val="24"/>
+              </w:rPr>
+              <w:t>.</w:t>
+            </w:r>
+          </w:p>
+          <w:p>
+            <w:pPr>
+              <w:rPr>
+                <w:rFonts w:eastAsiaTheme="majorEastAsia"/>
+                <w:color w:val="767171" w:themeColor="background2" w:themeShade="80"/>
+                <w:sz w:val="24"/>
+                <w:szCs w:val="24"/>
+              </w:rPr>
+            </w:pPr>
+          </w:p>
+          <w:p>
+            <w:pPr>
+              <w:rPr>
+                <w:rFonts w:eastAsiaTheme="majorEastAsia"/>
+                <w:color w:val="767171" w:themeColor="background2" w:themeShade="80"/>
+                <w:sz w:val="24"/>
+                <w:szCs w:val="24"/>
+              </w:rPr>
+            </w:pPr>
+            <w:r>
+              <w:rPr>
+                <w:rFonts w:eastAsiaTheme="majorEastAsia"/>
+                <w:color w:val="767171" w:themeColor="background2" w:themeShade="80"/>
+                <w:sz w:val="24"/>
+                <w:szCs w:val="24"/>
+              </w:rPr>
+              <w:t>También considero importante seguir mejorando la comunicación de aspectos técnicos, especialmente al momento de explicar una solución informática a personas que no necesariamente tienen conocimientos técnicos.</w:t>
+            </w:r>
+          </w:p>
+          <w:p>
+            <w:pPr>
+              <w:rPr>
+                <w:rFonts w:eastAsiaTheme="majorEastAsia"/>
+                <w:color w:val="767171" w:themeColor="background2" w:themeShade="80"/>
+                <w:sz w:val="24"/>
+                <w:szCs w:val="24"/>
+              </w:rPr>
+            </w:pPr>
+          </w:p>
+          <w:p>
+            <w:pPr>
+              <w:rPr>
+                <w:rFonts w:ascii="Times New Roman" w:eastAsia="Times New Roman" w:hAnsi="Times New Roman" w:cs="Times New Roman"/>
+                <w:sz w:val="24"/>
+                <w:szCs w:val="24"/>
+                <w:lang w:eastAsia="es-CL"/>
+              </w:rPr>
+            </w:pPr>
+            <w:r>
+              <w:rPr>
+                <w:rFonts w:eastAsiaTheme="majorEastAsia"/>
+                <w:color w:val="767171" w:themeColor="background2" w:themeShade="80"/>
+                <w:sz w:val="24"/>
+                <w:szCs w:val="24"/>
+              </w:rPr>
+              <w:t>El desarrollo del Proyecto APT representa una oportunidad para fortalecer estas competencias, ya que CITT Stock se desarrolla a partir de una necesidad real y requiere interacción con una contraparte</w:t>
+            </w:r>
+            <w:r>
+              <w:rPr>
+                <w:rFonts w:ascii="Times New Roman" w:eastAsia="Times New Roman" w:hAnsi="Times New Roman" w:cs="Times New Roman"/>
+                <w:sz w:val="24"/>
+                <w:szCs w:val="24"/>
+                <w:lang w:eastAsia="es-CL"/>
+              </w:rPr>
+              <w:t>.</w:t>
+            </w:r>
+          </w:p>
+          <w:p>
+            <w:pPr>
               <w:tabs>
                 <w:tab w:val="left" w:pos="454"/>
               </w:tabs>
@@ -782,204 +1276,6 @@
                 <w:color w:val="767171" w:themeColor="background2" w:themeShade="80"/>
                 <w:sz w:val="24"/>
                 <w:szCs w:val="24"/>
-              </w:rPr>
-            </w:pPr>
-          </w:p>
-          <w:p>
-            <w:pPr>
-              <w:tabs>
-                <w:tab w:val="left" w:pos="454"/>
-              </w:tabs>
-              <w:jc w:val="both"/>
-              <w:rPr>
-                <w:rFonts w:eastAsiaTheme="majorEastAsia"/>
-                <w:color w:val="767171" w:themeColor="background2" w:themeShade="80"/>
-                <w:sz w:val="24"/>
-                <w:szCs w:val="24"/>
-              </w:rPr>
-            </w:pPr>
-          </w:p>
-          <w:p>
-            <w:pPr>
-              <w:tabs>
-                <w:tab w:val="left" w:pos="454"/>
-              </w:tabs>
-              <w:jc w:val="both"/>
-              <w:rPr>
-                <w:rFonts w:eastAsiaTheme="majorEastAsia"/>
-                <w:color w:val="767171" w:themeColor="background2" w:themeShade="80"/>
-                <w:sz w:val="24"/>
-                <w:szCs w:val="24"/>
-              </w:rPr>
-            </w:pPr>
-          </w:p>
-          <w:p>
-            <w:pPr>
-              <w:tabs>
-                <w:tab w:val="left" w:pos="454"/>
-              </w:tabs>
-              <w:jc w:val="both"/>
-              <w:rPr>
-                <w:rFonts w:eastAsiaTheme="majorEastAsia"/>
-                <w:color w:val="767171" w:themeColor="background2" w:themeShade="80"/>
-                <w:sz w:val="24"/>
-                <w:szCs w:val="24"/>
-              </w:rPr>
-            </w:pPr>
-          </w:p>
-          <w:p>
-            <w:pPr>
-              <w:tabs>
-                <w:tab w:val="left" w:pos="454"/>
-              </w:tabs>
-              <w:jc w:val="both"/>
-              <w:rPr>
-                <w:rFonts w:eastAsiaTheme="majorEastAsia"/>
-                <w:color w:val="767171" w:themeColor="background2" w:themeShade="80"/>
-                <w:sz w:val="24"/>
-                <w:szCs w:val="24"/>
-              </w:rPr>
-            </w:pPr>
-          </w:p>
-          <w:p>
-            <w:pPr>
-              <w:tabs>
-                <w:tab w:val="left" w:pos="454"/>
-              </w:tabs>
-              <w:jc w:val="both"/>
-              <w:rPr>
-                <w:rFonts w:eastAsiaTheme="majorEastAsia"/>
-                <w:color w:val="767171" w:themeColor="background2" w:themeShade="80"/>
-                <w:sz w:val="24"/>
-                <w:szCs w:val="24"/>
-              </w:rPr>
-            </w:pPr>
-          </w:p>
-          <w:p>
-            <w:pPr>
-              <w:tabs>
-                <w:tab w:val="left" w:pos="454"/>
-              </w:tabs>
-              <w:jc w:val="both"/>
-              <w:rPr>
-                <w:rFonts w:eastAsiaTheme="majorEastAsia"/>
-                <w:color w:val="767171" w:themeColor="background2" w:themeShade="80"/>
-                <w:sz w:val="24"/>
-                <w:szCs w:val="24"/>
-              </w:rPr>
-            </w:pPr>
-          </w:p>
-          <w:p>
-            <w:pPr>
-              <w:tabs>
-                <w:tab w:val="left" w:pos="454"/>
-              </w:tabs>
-              <w:jc w:val="both"/>
-              <w:rPr>
-                <w:rFonts w:eastAsiaTheme="majorEastAsia"/>
-                <w:color w:val="767171" w:themeColor="background2" w:themeShade="80"/>
-                <w:sz w:val="24"/>
-                <w:szCs w:val="24"/>
-              </w:rPr>
-            </w:pPr>
-          </w:p>
-          <w:p>
-            <w:pPr>
-              <w:tabs>
-                <w:tab w:val="left" w:pos="454"/>
-              </w:tabs>
-              <w:jc w:val="both"/>
-              <w:rPr>
-                <w:rFonts w:eastAsiaTheme="majorEastAsia"/>
-                <w:color w:val="767171" w:themeColor="background2" w:themeShade="80"/>
-                <w:sz w:val="24"/>
-                <w:szCs w:val="24"/>
-              </w:rPr>
-            </w:pPr>
-          </w:p>
-          <w:p>
-            <w:pPr>
-              <w:tabs>
-                <w:tab w:val="left" w:pos="454"/>
-              </w:tabs>
-              <w:ind w:left="171"/>
-              <w:jc w:val="both"/>
-              <w:rPr>
-                <w:rFonts w:eastAsiaTheme="majorEastAsia"/>
-                <w:color w:val="767171" w:themeColor="background2" w:themeShade="80"/>
-                <w:sz w:val="24"/>
-                <w:szCs w:val="24"/>
-              </w:rPr>
-            </w:pPr>
-          </w:p>
-          <w:p>
-            <w:pPr>
-              <w:jc w:val="both"/>
-              <w:rPr>
-                <w:rFonts w:eastAsiaTheme="majorEastAsia"/>
-                <w:color w:val="767171" w:themeColor="background2" w:themeShade="80"/>
-                <w:sz w:val="24"/>
-                <w:szCs w:val="24"/>
-              </w:rPr>
-            </w:pPr>
-          </w:p>
-          <w:p>
-            <w:pPr>
-              <w:jc w:val="both"/>
-              <w:rPr>
-                <w:rFonts w:ascii="Calibri" w:hAnsi="Calibri"/>
-                <w:b/>
-                <w:bCs/>
-              </w:rPr>
-            </w:pPr>
-          </w:p>
-          <w:p>
-            <w:pPr>
-              <w:jc w:val="both"/>
-              <w:rPr>
-                <w:rFonts w:ascii="Calibri" w:hAnsi="Calibri"/>
-                <w:b/>
-                <w:bCs/>
-              </w:rPr>
-            </w:pPr>
-          </w:p>
-          <w:p>
-            <w:pPr>
-              <w:jc w:val="both"/>
-              <w:rPr>
-                <w:rFonts w:ascii="Calibri" w:hAnsi="Calibri"/>
-                <w:b/>
-                <w:bCs/>
-              </w:rPr>
-            </w:pPr>
-          </w:p>
-          <w:p>
-            <w:pPr>
-              <w:jc w:val="both"/>
-              <w:rPr>
-                <w:rFonts w:ascii="Calibri" w:hAnsi="Calibri"/>
-                <w:b/>
-                <w:bCs/>
-              </w:rPr>
-            </w:pPr>
-          </w:p>
-          <w:p>
-            <w:pPr>
-              <w:jc w:val="both"/>
-              <w:rPr>
-                <w:rFonts w:ascii="Calibri" w:hAnsi="Calibri"/>
-                <w:b/>
-                <w:bCs/>
-              </w:rPr>
-            </w:pPr>
-          </w:p>
-          <w:p>
-            <w:pPr>
-              <w:jc w:val="both"/>
-              <w:rPr>
-                <w:rFonts w:ascii="Calibri" w:hAnsi="Calibri"/>
-                <w:b/>
-                <w:bCs/>
               </w:rPr>
             </w:pPr>
           </w:p>
@@ -1010,53 +1306,478 @@
       </w:pPr>
     </w:p>
     <w:p/>
-    <w:p/>
-    <w:p/>
+    <w:tbl>
+      <w:tblPr>
+        <w:tblStyle w:val="Tablaconcuadrcula"/>
+        <w:tblW w:w="0" w:type="auto"/>
+        <w:tblBorders>
+          <w:top w:val="single" w:sz="4" w:space="0" w:color="BFBFBF" w:themeColor="background1" w:themeShade="BF"/>
+          <w:left w:val="single" w:sz="4" w:space="0" w:color="BFBFBF" w:themeColor="background1" w:themeShade="BF"/>
+          <w:bottom w:val="single" w:sz="4" w:space="0" w:color="BFBFBF" w:themeColor="background1" w:themeShade="BF"/>
+          <w:right w:val="single" w:sz="4" w:space="0" w:color="BFBFBF" w:themeColor="background1" w:themeShade="BF"/>
+          <w:insideH w:val="single" w:sz="4" w:space="0" w:color="BFBFBF" w:themeColor="background1" w:themeShade="BF"/>
+          <w:insideV w:val="single" w:sz="4" w:space="0" w:color="BFBFBF" w:themeColor="background1" w:themeShade="BF"/>
+        </w:tblBorders>
+        <w:tblLook w:val="04A0" w:firstRow="1" w:lastRow="0" w:firstColumn="1" w:lastColumn="0" w:noHBand="0" w:noVBand="1"/>
+      </w:tblPr>
+      <w:tblGrid>
+        <w:gridCol w:w="10076"/>
+      </w:tblGrid>
+      <w:tr>
+        <w:trPr>
+          <w:trHeight w:val="440"/>
+        </w:trPr>
+        <w:tc>
+          <w:tcPr>
+            <w:tcW w:w="10076" w:type="dxa"/>
+            <w:vAlign w:val="center"/>
+          </w:tcPr>
+          <w:p>
+            <w:pPr>
+              <w:jc w:val="both"/>
+              <w:rPr>
+                <w:rFonts w:eastAsiaTheme="majorEastAsia"/>
+                <w:color w:val="767171" w:themeColor="background2" w:themeShade="80"/>
+                <w:sz w:val="24"/>
+                <w:szCs w:val="24"/>
+              </w:rPr>
+            </w:pPr>
+            <w:r>
+              <w:rPr>
+                <w:rFonts w:eastAsiaTheme="majorEastAsia"/>
+                <w:sz w:val="24"/>
+                <w:szCs w:val="24"/>
+              </w:rPr>
+              <w:t>3. A partir de las respuestas anteriores y el perfil de egreso de tu carrera (competencias), responde las siguientes preguntas:</w:t>
+            </w:r>
+          </w:p>
+        </w:tc>
+      </w:tr>
+      <w:tr>
+        <w:trPr>
+          <w:trHeight w:val="440"/>
+        </w:trPr>
+        <w:tc>
+          <w:tcPr>
+            <w:tcW w:w="10076" w:type="dxa"/>
+            <w:shd w:val="clear" w:color="auto" w:fill="DEEAF6" w:themeFill="accent1" w:themeFillTint="33"/>
+            <w:vAlign w:val="center"/>
+          </w:tcPr>
+          <w:p>
+            <w:pPr>
+              <w:rPr>
+                <w:rFonts w:eastAsiaTheme="majorEastAsia"/>
+                <w:color w:val="767171" w:themeColor="background2" w:themeShade="80"/>
+                <w:sz w:val="24"/>
+                <w:szCs w:val="24"/>
+              </w:rPr>
+            </w:pPr>
+          </w:p>
+          <w:p>
+            <w:pPr>
+              <w:pStyle w:val="Prrafodelista"/>
+              <w:numPr>
+                <w:ilvl w:val="0"/>
+                <w:numId w:val="12"/>
+              </w:numPr>
+              <w:tabs>
+                <w:tab w:val="left" w:pos="454"/>
+              </w:tabs>
+              <w:ind w:left="454" w:hanging="283"/>
+              <w:jc w:val="both"/>
+              <w:rPr>
+                <w:rFonts w:eastAsiaTheme="majorEastAsia"/>
+                <w:color w:val="767171" w:themeColor="background2" w:themeShade="80"/>
+                <w:sz w:val="24"/>
+                <w:szCs w:val="24"/>
+              </w:rPr>
+            </w:pPr>
+            <w:r>
+              <w:rPr>
+                <w:rFonts w:eastAsiaTheme="majorEastAsia"/>
+                <w:sz w:val="24"/>
+                <w:szCs w:val="24"/>
+              </w:rPr>
+              <w:t>¿Cuáles son tus principales intereses profesionales? ¿Hay alguna área de desempeño que te interese más?</w:t>
+            </w:r>
+          </w:p>
+          <w:p>
+            <w:pPr>
+              <w:spacing w:before="100" w:beforeAutospacing="1" w:after="100" w:afterAutospacing="1"/>
+              <w:rPr>
+                <w:rFonts w:eastAsiaTheme="majorEastAsia"/>
+                <w:color w:val="767171" w:themeColor="background2" w:themeShade="80"/>
+                <w:sz w:val="24"/>
+                <w:szCs w:val="24"/>
+              </w:rPr>
+            </w:pPr>
+            <w:r>
+              <w:rPr>
+                <w:rFonts w:eastAsiaTheme="majorEastAsia"/>
+                <w:color w:val="767171" w:themeColor="background2" w:themeShade="80"/>
+                <w:sz w:val="24"/>
+                <w:szCs w:val="24"/>
+              </w:rPr>
+              <w:t>Mi principal interés profesional es el Desarrollo Web y la creación de soluciones informáticas que automaticen procesos. Me llama mucho la atención el área de Desarrollo Front-</w:t>
+            </w:r>
+            <w:proofErr w:type="spellStart"/>
+            <w:r>
+              <w:rPr>
+                <w:rFonts w:eastAsiaTheme="majorEastAsia"/>
+                <w:color w:val="767171" w:themeColor="background2" w:themeShade="80"/>
+                <w:sz w:val="24"/>
+                <w:szCs w:val="24"/>
+              </w:rPr>
+              <w:t>End</w:t>
+            </w:r>
+            <w:proofErr w:type="spellEnd"/>
+            <w:r>
+              <w:rPr>
+                <w:rFonts w:eastAsiaTheme="majorEastAsia"/>
+                <w:color w:val="767171" w:themeColor="background2" w:themeShade="80"/>
+                <w:sz w:val="24"/>
+                <w:szCs w:val="24"/>
+              </w:rPr>
+              <w:t xml:space="preserve"> y la Gestión de Proyectos de Software, donde pueda transformar necesidades complejas de un cliente en plataformas amigables y eficientes.</w:t>
+            </w:r>
+            <w:r>
+              <w:rPr>
+                <w:rFonts w:eastAsiaTheme="majorEastAsia"/>
+                <w:color w:val="767171" w:themeColor="background2" w:themeShade="80"/>
+                <w:sz w:val="24"/>
+                <w:szCs w:val="24"/>
+              </w:rPr>
+              <w:t xml:space="preserve"> </w:t>
+            </w:r>
+          </w:p>
+          <w:p>
+            <w:pPr>
+              <w:tabs>
+                <w:tab w:val="left" w:pos="454"/>
+              </w:tabs>
+              <w:jc w:val="both"/>
+              <w:rPr>
+                <w:rFonts w:eastAsiaTheme="majorEastAsia"/>
+                <w:color w:val="767171" w:themeColor="background2" w:themeShade="80"/>
+                <w:sz w:val="24"/>
+                <w:szCs w:val="24"/>
+              </w:rPr>
+            </w:pPr>
+          </w:p>
+          <w:p>
+            <w:pPr>
+              <w:pStyle w:val="Prrafodelista"/>
+              <w:numPr>
+                <w:ilvl w:val="0"/>
+                <w:numId w:val="12"/>
+              </w:numPr>
+              <w:tabs>
+                <w:tab w:val="left" w:pos="454"/>
+              </w:tabs>
+              <w:ind w:left="454" w:hanging="283"/>
+              <w:jc w:val="both"/>
+              <w:rPr>
+                <w:rFonts w:eastAsiaTheme="majorEastAsia"/>
+                <w:color w:val="767171" w:themeColor="background2" w:themeShade="80"/>
+                <w:sz w:val="24"/>
+                <w:szCs w:val="24"/>
+              </w:rPr>
+            </w:pPr>
+            <w:r>
+              <w:rPr>
+                <w:rFonts w:eastAsiaTheme="majorEastAsia"/>
+                <w:sz w:val="24"/>
+                <w:szCs w:val="24"/>
+              </w:rPr>
+              <w:t>¿Cuáles son las principales competencias que se relacionan con tus intereses profesionales? ¿Hay alguna de ellas que sientas que requieres especialmente fortalecer?</w:t>
+            </w:r>
+          </w:p>
+          <w:p>
+            <w:pPr>
+              <w:tabs>
+                <w:tab w:val="left" w:pos="454"/>
+              </w:tabs>
+              <w:jc w:val="both"/>
+              <w:rPr>
+                <w:rFonts w:eastAsiaTheme="majorEastAsia"/>
+                <w:color w:val="767171" w:themeColor="background2" w:themeShade="80"/>
+                <w:sz w:val="24"/>
+                <w:szCs w:val="24"/>
+              </w:rPr>
+            </w:pPr>
+          </w:p>
+          <w:p>
+            <w:pPr>
+              <w:spacing w:before="100" w:beforeAutospacing="1" w:after="100" w:afterAutospacing="1"/>
+              <w:rPr>
+                <w:rFonts w:eastAsiaTheme="majorEastAsia"/>
+                <w:color w:val="767171" w:themeColor="background2" w:themeShade="80"/>
+                <w:sz w:val="24"/>
+                <w:szCs w:val="24"/>
+              </w:rPr>
+            </w:pPr>
+            <w:r>
+              <w:rPr>
+                <w:rFonts w:eastAsiaTheme="majorEastAsia"/>
+                <w:color w:val="767171" w:themeColor="background2" w:themeShade="80"/>
+                <w:sz w:val="24"/>
+                <w:szCs w:val="24"/>
+              </w:rPr>
+              <w:t>Se relacionan fuertemente con la competencia de "diseñar, desarrollar e implementar soluciones informáticas resolviendo problemas complejos" y el "trabajo colaborativo interdisciplinario". Como mencioné antes, necesito fortalecer la evaluación de estándares de seguridad y optimización de bases de datos de alto volumen para asegurar que el software escale sin problemas.</w:t>
+            </w:r>
+          </w:p>
+          <w:p>
+            <w:pPr>
+              <w:tabs>
+                <w:tab w:val="left" w:pos="454"/>
+              </w:tabs>
+              <w:jc w:val="both"/>
+              <w:rPr>
+                <w:rFonts w:eastAsiaTheme="majorEastAsia"/>
+                <w:color w:val="767171" w:themeColor="background2" w:themeShade="80"/>
+                <w:sz w:val="24"/>
+                <w:szCs w:val="24"/>
+              </w:rPr>
+            </w:pPr>
+          </w:p>
+          <w:p>
+            <w:pPr>
+              <w:pStyle w:val="Prrafodelista"/>
+              <w:numPr>
+                <w:ilvl w:val="0"/>
+                <w:numId w:val="12"/>
+              </w:numPr>
+              <w:tabs>
+                <w:tab w:val="left" w:pos="454"/>
+              </w:tabs>
+              <w:ind w:left="454" w:hanging="283"/>
+              <w:jc w:val="both"/>
+              <w:rPr>
+                <w:rFonts w:eastAsiaTheme="majorEastAsia"/>
+                <w:color w:val="767171" w:themeColor="background2" w:themeShade="80"/>
+                <w:sz w:val="24"/>
+                <w:szCs w:val="24"/>
+              </w:rPr>
+            </w:pPr>
+            <w:r>
+              <w:rPr>
+                <w:rFonts w:eastAsiaTheme="majorEastAsia"/>
+                <w:sz w:val="24"/>
+                <w:szCs w:val="24"/>
+              </w:rPr>
+              <w:t>¿Cómo te gustaría que fuera tu escenario laboral en 5 años más? ¿Qué te gustaría estar haciendo?</w:t>
+            </w:r>
+          </w:p>
+          <w:p>
+            <w:pPr>
+              <w:tabs>
+                <w:tab w:val="left" w:pos="454"/>
+              </w:tabs>
+              <w:jc w:val="both"/>
+              <w:rPr>
+                <w:rFonts w:eastAsiaTheme="majorEastAsia"/>
+                <w:color w:val="767171" w:themeColor="background2" w:themeShade="80"/>
+                <w:sz w:val="24"/>
+                <w:szCs w:val="24"/>
+              </w:rPr>
+            </w:pPr>
+          </w:p>
+          <w:p>
+            <w:pPr>
+              <w:spacing w:before="100" w:beforeAutospacing="1" w:after="100" w:afterAutospacing="1"/>
+              <w:rPr>
+                <w:rFonts w:eastAsiaTheme="majorEastAsia"/>
+                <w:color w:val="767171" w:themeColor="background2" w:themeShade="80"/>
+                <w:sz w:val="24"/>
+                <w:szCs w:val="24"/>
+              </w:rPr>
+            </w:pPr>
+            <w:r>
+              <w:rPr>
+                <w:rFonts w:eastAsiaTheme="majorEastAsia"/>
+                <w:color w:val="767171" w:themeColor="background2" w:themeShade="80"/>
+                <w:sz w:val="24"/>
+                <w:szCs w:val="24"/>
+              </w:rPr>
+              <w:t xml:space="preserve">En 5 años me gustaría estar trabajando como Desarrollador/a Senior, </w:t>
+            </w:r>
+            <w:proofErr w:type="spellStart"/>
+            <w:r>
+              <w:rPr>
+                <w:rFonts w:eastAsiaTheme="majorEastAsia"/>
+                <w:color w:val="767171" w:themeColor="background2" w:themeShade="80"/>
+                <w:sz w:val="24"/>
+                <w:szCs w:val="24"/>
+              </w:rPr>
+              <w:t>Tech</w:t>
+            </w:r>
+            <w:proofErr w:type="spellEnd"/>
+            <w:r>
+              <w:rPr>
+                <w:rFonts w:eastAsiaTheme="majorEastAsia"/>
+                <w:color w:val="767171" w:themeColor="background2" w:themeShade="80"/>
+                <w:sz w:val="24"/>
+                <w:szCs w:val="24"/>
+              </w:rPr>
+              <w:t xml:space="preserve"> Lead o </w:t>
+            </w:r>
+            <w:proofErr w:type="spellStart"/>
+            <w:r>
+              <w:rPr>
+                <w:rFonts w:eastAsiaTheme="majorEastAsia"/>
+                <w:color w:val="767171" w:themeColor="background2" w:themeShade="80"/>
+                <w:sz w:val="24"/>
+                <w:szCs w:val="24"/>
+              </w:rPr>
+              <w:t>Scrum</w:t>
+            </w:r>
+            <w:proofErr w:type="spellEnd"/>
+            <w:r>
+              <w:rPr>
+                <w:rFonts w:eastAsiaTheme="majorEastAsia"/>
+                <w:color w:val="767171" w:themeColor="background2" w:themeShade="80"/>
+                <w:sz w:val="24"/>
+                <w:szCs w:val="24"/>
+              </w:rPr>
+              <w:t xml:space="preserve"> Master en una empresa de tecnología o liderando mi propia consultora. Me veo dirigiendo equipos, tomando decisiones arquitectónicas sobre desarrollo de software y siendo parte de la transformación digital de organizaciones.</w:t>
+            </w:r>
+          </w:p>
+          <w:p>
+            <w:pPr>
+              <w:tabs>
+                <w:tab w:val="left" w:pos="454"/>
+              </w:tabs>
+              <w:jc w:val="both"/>
+              <w:rPr>
+                <w:rFonts w:eastAsiaTheme="majorEastAsia"/>
+                <w:color w:val="767171" w:themeColor="background2" w:themeShade="80"/>
+                <w:sz w:val="24"/>
+                <w:szCs w:val="24"/>
+              </w:rPr>
+            </w:pPr>
+          </w:p>
+          <w:p>
+            <w:pPr>
+              <w:jc w:val="both"/>
+              <w:rPr>
+                <w:rFonts w:ascii="Calibri" w:hAnsi="Calibri"/>
+                <w:b/>
+                <w:bCs/>
+                <w:color w:val="1F4E79" w:themeColor="accent1" w:themeShade="80"/>
+              </w:rPr>
+            </w:pPr>
+          </w:p>
+          <w:p>
+            <w:pPr>
+              <w:jc w:val="both"/>
+              <w:rPr>
+                <w:rFonts w:ascii="Calibri" w:hAnsi="Calibri"/>
+                <w:b/>
+                <w:bCs/>
+                <w:color w:val="1F4E79" w:themeColor="accent1" w:themeShade="80"/>
+              </w:rPr>
+            </w:pPr>
+          </w:p>
+          <w:p>
+            <w:pPr>
+              <w:jc w:val="both"/>
+              <w:rPr>
+                <w:rFonts w:ascii="Calibri" w:hAnsi="Calibri"/>
+                <w:b/>
+                <w:bCs/>
+                <w:color w:val="1F4E79" w:themeColor="accent1" w:themeShade="80"/>
+              </w:rPr>
+            </w:pPr>
+          </w:p>
+          <w:p>
+            <w:pPr>
+              <w:jc w:val="both"/>
+              <w:rPr>
+                <w:rFonts w:ascii="Calibri" w:hAnsi="Calibri"/>
+                <w:b/>
+                <w:bCs/>
+                <w:color w:val="1F4E79" w:themeColor="accent1" w:themeShade="80"/>
+              </w:rPr>
+            </w:pPr>
+          </w:p>
+          <w:p>
+            <w:pPr>
+              <w:jc w:val="both"/>
+              <w:rPr>
+                <w:rFonts w:ascii="Calibri" w:hAnsi="Calibri"/>
+                <w:b/>
+                <w:bCs/>
+                <w:color w:val="1F4E79" w:themeColor="accent1" w:themeShade="80"/>
+              </w:rPr>
+            </w:pPr>
+          </w:p>
+          <w:p>
+            <w:pPr>
+              <w:jc w:val="both"/>
+              <w:rPr>
+                <w:rFonts w:ascii="Calibri" w:hAnsi="Calibri"/>
+                <w:b/>
+                <w:bCs/>
+                <w:color w:val="1F4E79" w:themeColor="accent1" w:themeShade="80"/>
+              </w:rPr>
+            </w:pPr>
+          </w:p>
+          <w:p>
+            <w:pPr>
+              <w:jc w:val="both"/>
+              <w:rPr>
+                <w:rFonts w:ascii="Calibri" w:hAnsi="Calibri"/>
+                <w:b/>
+                <w:bCs/>
+                <w:color w:val="1F4E79" w:themeColor="accent1" w:themeShade="80"/>
+              </w:rPr>
+            </w:pPr>
+          </w:p>
+          <w:p>
+            <w:pPr>
+              <w:jc w:val="both"/>
+              <w:rPr>
+                <w:rFonts w:ascii="Calibri" w:hAnsi="Calibri"/>
+                <w:b/>
+                <w:bCs/>
+                <w:color w:val="1F4E79" w:themeColor="accent1" w:themeShade="80"/>
+              </w:rPr>
+            </w:pPr>
+          </w:p>
+          <w:p>
+            <w:pPr>
+              <w:jc w:val="both"/>
+              <w:rPr>
+                <w:rFonts w:ascii="Calibri" w:hAnsi="Calibri"/>
+                <w:b/>
+                <w:bCs/>
+                <w:color w:val="1F4E79" w:themeColor="accent1" w:themeShade="80"/>
+              </w:rPr>
+            </w:pPr>
+          </w:p>
+          <w:p>
+            <w:pPr>
+              <w:jc w:val="both"/>
+              <w:rPr>
+                <w:rFonts w:ascii="Calibri" w:hAnsi="Calibri"/>
+                <w:b/>
+                <w:bCs/>
+                <w:color w:val="1F4E79" w:themeColor="accent1" w:themeShade="80"/>
+              </w:rPr>
+            </w:pPr>
+          </w:p>
+        </w:tc>
+      </w:tr>
+    </w:tbl>
     <w:p>
       <w:pPr>
         <w:spacing w:after="0" w:line="360" w:lineRule="auto"/>
         <w:jc w:val="both"/>
         <w:rPr>
-          <w:b/>
-          <w:bCs/>
+          <w:color w:val="595959" w:themeColor="text1" w:themeTint="A6"/>
           <w:sz w:val="24"/>
           <w:szCs w:val="24"/>
-        </w:rPr>
-      </w:pPr>
-    </w:p>
-    <w:p>
-      <w:pPr>
-        <w:spacing w:after="0" w:line="360" w:lineRule="auto"/>
-        <w:jc w:val="both"/>
-        <w:rPr>
-          <w:b/>
-          <w:bCs/>
-          <w:sz w:val="24"/>
-          <w:szCs w:val="24"/>
-        </w:rPr>
-      </w:pPr>
-    </w:p>
-    <w:p>
-      <w:pPr>
-        <w:spacing w:after="0" w:line="360" w:lineRule="auto"/>
-        <w:jc w:val="both"/>
-        <w:rPr>
-          <w:b/>
-          <w:bCs/>
-          <w:sz w:val="24"/>
-          <w:szCs w:val="24"/>
-        </w:rPr>
-      </w:pPr>
-    </w:p>
-    <w:p>
-      <w:pPr>
-        <w:spacing w:after="0" w:line="360" w:lineRule="auto"/>
-        <w:jc w:val="both"/>
-        <w:rPr>
-          <w:b/>
-          <w:bCs/>
-          <w:sz w:val="24"/>
-          <w:szCs w:val="24"/>
+          <w:lang w:eastAsia="ja-JP"/>
         </w:rPr>
       </w:pPr>
     </w:p>
@@ -1150,10 +1871,9 @@
             <w:pPr>
               <w:jc w:val="both"/>
               <w:rPr>
-                <w:rFonts w:eastAsiaTheme="majorEastAsia"/>
-                <w:color w:val="767171" w:themeColor="background2" w:themeShade="80"/>
-                <w:sz w:val="24"/>
-                <w:szCs w:val="24"/>
+                <w:rFonts w:ascii="Century Gothic" w:hAnsi="Century Gothic"/>
+                <w:sz w:val="20"/>
+                <w:szCs w:val="20"/>
               </w:rPr>
             </w:pPr>
             <w:r>
@@ -1162,7 +1882,7 @@
                 <w:sz w:val="24"/>
                 <w:szCs w:val="24"/>
               </w:rPr>
-              <w:t>3. A partir de las respuestas anteriores y el perfil de egreso de tu carrera (competencias), responde las siguientes preguntas:</w:t>
+              <w:t xml:space="preserve">4. Finalmente, piensa en el proyecto que desarrollarás en APT y responde a las siguientes preguntas: </w:t>
             </w:r>
           </w:p>
         </w:tc>
@@ -1212,7 +1932,7 @@
                 <w:sz w:val="24"/>
                 <w:szCs w:val="24"/>
               </w:rPr>
-              <w:t>¿Cuáles son tus principales intereses profesionales? ¿Hay alguna área de desempeño que te interese más?</w:t>
+              <w:t>Los Proyectos APT que ya habías diseñado como plan de trabajo en el curso anterior, ¿se relacionan con tus proyecciones profesionales actuales? ¿cuál se relaciona más? ¿Requiere ajuste?</w:t>
             </w:r>
           </w:p>
           <w:p>
@@ -1228,6 +1948,26 @@
                 <w:szCs w:val="24"/>
               </w:rPr>
             </w:pPr>
+            <w:r>
+              <w:lastRenderedPageBreak/>
+              <w:t>Este proyecto aborda directamente el área de Desarrollo Web y Gestión de Requerimientos. Nos ayuda enormemente en nuestro desarrollo profesional porque nos saca del aula para situarnos en un contexto real y tangible: resolver un problema operativo del CITT de nuestra propia sede. Trabajar con plazos, un cliente real, tecnologías modernas (</w:t>
+            </w:r>
+            <w:proofErr w:type="spellStart"/>
+            <w:r>
+              <w:t>Tailwind</w:t>
+            </w:r>
+            <w:proofErr w:type="spellEnd"/>
+            <w:r>
+              <w:t xml:space="preserve">, JS) y </w:t>
+            </w:r>
+            <w:proofErr w:type="spellStart"/>
+            <w:r>
+              <w:t>versionamiento</w:t>
+            </w:r>
+            <w:proofErr w:type="spellEnd"/>
+            <w:r>
+              <w:t xml:space="preserve"> en GitHub es la simulación perfecta de lo que viviremos en el campo laboral.</w:t>
+            </w:r>
           </w:p>
           <w:p>
             <w:pPr>
@@ -1242,675 +1982,8 @@
                 <w:szCs w:val="24"/>
               </w:rPr>
             </w:pPr>
-          </w:p>
-          <w:p>
-            <w:pPr>
-              <w:tabs>
-                <w:tab w:val="left" w:pos="454"/>
-              </w:tabs>
-              <w:jc w:val="both"/>
-              <w:rPr>
-                <w:rFonts w:eastAsiaTheme="majorEastAsia"/>
-                <w:color w:val="767171" w:themeColor="background2" w:themeShade="80"/>
-                <w:sz w:val="24"/>
-                <w:szCs w:val="24"/>
-              </w:rPr>
-            </w:pPr>
-          </w:p>
-          <w:p>
-            <w:pPr>
-              <w:tabs>
-                <w:tab w:val="left" w:pos="454"/>
-              </w:tabs>
-              <w:jc w:val="both"/>
-              <w:rPr>
-                <w:rFonts w:eastAsiaTheme="majorEastAsia"/>
-                <w:color w:val="767171" w:themeColor="background2" w:themeShade="80"/>
-                <w:sz w:val="24"/>
-                <w:szCs w:val="24"/>
-              </w:rPr>
-            </w:pPr>
-          </w:p>
-          <w:p>
-            <w:pPr>
-              <w:tabs>
-                <w:tab w:val="left" w:pos="454"/>
-              </w:tabs>
-              <w:jc w:val="both"/>
-              <w:rPr>
-                <w:rFonts w:eastAsiaTheme="majorEastAsia"/>
-                <w:color w:val="767171" w:themeColor="background2" w:themeShade="80"/>
-                <w:sz w:val="24"/>
-                <w:szCs w:val="24"/>
-              </w:rPr>
-            </w:pPr>
-          </w:p>
-          <w:p>
-            <w:pPr>
-              <w:tabs>
-                <w:tab w:val="left" w:pos="454"/>
-              </w:tabs>
-              <w:jc w:val="both"/>
-              <w:rPr>
-                <w:rFonts w:eastAsiaTheme="majorEastAsia"/>
-                <w:color w:val="767171" w:themeColor="background2" w:themeShade="80"/>
-                <w:sz w:val="24"/>
-                <w:szCs w:val="24"/>
-              </w:rPr>
-            </w:pPr>
-          </w:p>
-          <w:p>
-            <w:pPr>
-              <w:tabs>
-                <w:tab w:val="left" w:pos="454"/>
-              </w:tabs>
-              <w:jc w:val="both"/>
-              <w:rPr>
-                <w:rFonts w:eastAsiaTheme="majorEastAsia"/>
-                <w:color w:val="767171" w:themeColor="background2" w:themeShade="80"/>
-                <w:sz w:val="24"/>
-                <w:szCs w:val="24"/>
-              </w:rPr>
-            </w:pPr>
-          </w:p>
-          <w:p>
-            <w:pPr>
-              <w:pStyle w:val="Prrafodelista"/>
-              <w:numPr>
-                <w:ilvl w:val="0"/>
-                <w:numId w:val="12"/>
-              </w:numPr>
-              <w:tabs>
-                <w:tab w:val="left" w:pos="454"/>
-              </w:tabs>
-              <w:ind w:left="454" w:hanging="283"/>
-              <w:jc w:val="both"/>
-              <w:rPr>
-                <w:rFonts w:eastAsiaTheme="majorEastAsia"/>
-                <w:color w:val="767171" w:themeColor="background2" w:themeShade="80"/>
-                <w:sz w:val="24"/>
-                <w:szCs w:val="24"/>
-              </w:rPr>
-            </w:pPr>
-            <w:r>
-              <w:rPr>
-                <w:rFonts w:eastAsiaTheme="majorEastAsia"/>
-                <w:sz w:val="24"/>
-                <w:szCs w:val="24"/>
-              </w:rPr>
-              <w:t>¿Cuáles son las principales competencias que se relacionan con tus intereses profesionales? ¿Hay alguna de ellas que sientas que requieres especialmente fortalecer?</w:t>
-            </w:r>
-          </w:p>
-          <w:p>
-            <w:pPr>
-              <w:tabs>
-                <w:tab w:val="left" w:pos="454"/>
-              </w:tabs>
-              <w:jc w:val="both"/>
-              <w:rPr>
-                <w:rFonts w:eastAsiaTheme="majorEastAsia"/>
-                <w:color w:val="767171" w:themeColor="background2" w:themeShade="80"/>
-                <w:sz w:val="24"/>
-                <w:szCs w:val="24"/>
-              </w:rPr>
-            </w:pPr>
-          </w:p>
-          <w:p>
-            <w:pPr>
-              <w:tabs>
-                <w:tab w:val="left" w:pos="454"/>
-              </w:tabs>
-              <w:jc w:val="both"/>
-              <w:rPr>
-                <w:rFonts w:eastAsiaTheme="majorEastAsia"/>
-                <w:color w:val="767171" w:themeColor="background2" w:themeShade="80"/>
-                <w:sz w:val="24"/>
-                <w:szCs w:val="24"/>
-              </w:rPr>
-            </w:pPr>
-          </w:p>
-          <w:p>
-            <w:pPr>
-              <w:tabs>
-                <w:tab w:val="left" w:pos="454"/>
-              </w:tabs>
-              <w:jc w:val="both"/>
-              <w:rPr>
-                <w:rFonts w:eastAsiaTheme="majorEastAsia"/>
-                <w:color w:val="767171" w:themeColor="background2" w:themeShade="80"/>
-                <w:sz w:val="24"/>
-                <w:szCs w:val="24"/>
-              </w:rPr>
-            </w:pPr>
-          </w:p>
-          <w:p>
-            <w:pPr>
-              <w:tabs>
-                <w:tab w:val="left" w:pos="454"/>
-              </w:tabs>
-              <w:jc w:val="both"/>
-              <w:rPr>
-                <w:rFonts w:eastAsiaTheme="majorEastAsia"/>
-                <w:color w:val="767171" w:themeColor="background2" w:themeShade="80"/>
-                <w:sz w:val="24"/>
-                <w:szCs w:val="24"/>
-              </w:rPr>
-            </w:pPr>
-          </w:p>
-          <w:p>
-            <w:pPr>
-              <w:tabs>
-                <w:tab w:val="left" w:pos="454"/>
-              </w:tabs>
-              <w:jc w:val="both"/>
-              <w:rPr>
-                <w:rFonts w:eastAsiaTheme="majorEastAsia"/>
-                <w:color w:val="767171" w:themeColor="background2" w:themeShade="80"/>
-                <w:sz w:val="24"/>
-                <w:szCs w:val="24"/>
-              </w:rPr>
-            </w:pPr>
-          </w:p>
-          <w:p>
-            <w:pPr>
-              <w:tabs>
-                <w:tab w:val="left" w:pos="454"/>
-              </w:tabs>
-              <w:jc w:val="both"/>
-              <w:rPr>
-                <w:rFonts w:eastAsiaTheme="majorEastAsia"/>
-                <w:color w:val="767171" w:themeColor="background2" w:themeShade="80"/>
-                <w:sz w:val="24"/>
-                <w:szCs w:val="24"/>
-              </w:rPr>
-            </w:pPr>
-          </w:p>
-          <w:p>
-            <w:pPr>
-              <w:tabs>
-                <w:tab w:val="left" w:pos="454"/>
-              </w:tabs>
-              <w:jc w:val="both"/>
-              <w:rPr>
-                <w:rFonts w:eastAsiaTheme="majorEastAsia"/>
-                <w:color w:val="767171" w:themeColor="background2" w:themeShade="80"/>
-                <w:sz w:val="24"/>
-                <w:szCs w:val="24"/>
-              </w:rPr>
-            </w:pPr>
-          </w:p>
-          <w:p>
-            <w:pPr>
-              <w:tabs>
-                <w:tab w:val="left" w:pos="454"/>
-              </w:tabs>
-              <w:jc w:val="both"/>
-              <w:rPr>
-                <w:rFonts w:eastAsiaTheme="majorEastAsia"/>
-                <w:color w:val="767171" w:themeColor="background2" w:themeShade="80"/>
-                <w:sz w:val="24"/>
-                <w:szCs w:val="24"/>
-              </w:rPr>
-            </w:pPr>
-          </w:p>
-          <w:p>
-            <w:pPr>
-              <w:pStyle w:val="Prrafodelista"/>
-              <w:numPr>
-                <w:ilvl w:val="0"/>
-                <w:numId w:val="12"/>
-              </w:numPr>
-              <w:tabs>
-                <w:tab w:val="left" w:pos="454"/>
-              </w:tabs>
-              <w:ind w:left="454" w:hanging="283"/>
-              <w:jc w:val="both"/>
-              <w:rPr>
-                <w:rFonts w:eastAsiaTheme="majorEastAsia"/>
-                <w:color w:val="767171" w:themeColor="background2" w:themeShade="80"/>
-                <w:sz w:val="24"/>
-                <w:szCs w:val="24"/>
-              </w:rPr>
-            </w:pPr>
-            <w:r>
-              <w:rPr>
-                <w:rFonts w:eastAsiaTheme="majorEastAsia"/>
-                <w:sz w:val="24"/>
-                <w:szCs w:val="24"/>
-              </w:rPr>
-              <w:t>¿Cómo te gustaría que fuera tu escenario laboral en 5 años más? ¿Qué te gustaría estar haciendo?</w:t>
-            </w:r>
-          </w:p>
-          <w:p>
-            <w:pPr>
-              <w:tabs>
-                <w:tab w:val="left" w:pos="454"/>
-              </w:tabs>
-              <w:jc w:val="both"/>
-              <w:rPr>
-                <w:rFonts w:eastAsiaTheme="majorEastAsia"/>
-                <w:color w:val="767171" w:themeColor="background2" w:themeShade="80"/>
-                <w:sz w:val="24"/>
-                <w:szCs w:val="24"/>
-              </w:rPr>
-            </w:pPr>
-          </w:p>
-          <w:p>
-            <w:pPr>
-              <w:tabs>
-                <w:tab w:val="left" w:pos="454"/>
-              </w:tabs>
-              <w:jc w:val="both"/>
-              <w:rPr>
-                <w:rFonts w:eastAsiaTheme="majorEastAsia"/>
-                <w:color w:val="767171" w:themeColor="background2" w:themeShade="80"/>
-                <w:sz w:val="24"/>
-                <w:szCs w:val="24"/>
-              </w:rPr>
-            </w:pPr>
-          </w:p>
-          <w:p>
-            <w:pPr>
-              <w:tabs>
-                <w:tab w:val="left" w:pos="454"/>
-              </w:tabs>
-              <w:jc w:val="both"/>
-              <w:rPr>
-                <w:rFonts w:eastAsiaTheme="majorEastAsia"/>
-                <w:color w:val="767171" w:themeColor="background2" w:themeShade="80"/>
-                <w:sz w:val="24"/>
-                <w:szCs w:val="24"/>
-              </w:rPr>
-            </w:pPr>
-          </w:p>
-          <w:p>
-            <w:pPr>
-              <w:jc w:val="both"/>
-              <w:rPr>
-                <w:rFonts w:ascii="Calibri" w:hAnsi="Calibri"/>
-                <w:b/>
-                <w:bCs/>
-                <w:color w:val="1F4E79" w:themeColor="accent1" w:themeShade="80"/>
-              </w:rPr>
-            </w:pPr>
-          </w:p>
-          <w:p>
-            <w:pPr>
-              <w:jc w:val="both"/>
-              <w:rPr>
-                <w:rFonts w:ascii="Calibri" w:hAnsi="Calibri"/>
-                <w:b/>
-                <w:bCs/>
-                <w:color w:val="1F4E79" w:themeColor="accent1" w:themeShade="80"/>
-              </w:rPr>
-            </w:pPr>
-          </w:p>
-          <w:p>
-            <w:pPr>
-              <w:jc w:val="both"/>
-              <w:rPr>
-                <w:rFonts w:ascii="Calibri" w:hAnsi="Calibri"/>
-                <w:b/>
-                <w:bCs/>
-                <w:color w:val="1F4E79" w:themeColor="accent1" w:themeShade="80"/>
-              </w:rPr>
-            </w:pPr>
-          </w:p>
-          <w:p>
-            <w:pPr>
-              <w:jc w:val="both"/>
-              <w:rPr>
-                <w:rFonts w:ascii="Calibri" w:hAnsi="Calibri"/>
-                <w:b/>
-                <w:bCs/>
-                <w:color w:val="1F4E79" w:themeColor="accent1" w:themeShade="80"/>
-              </w:rPr>
-            </w:pPr>
-          </w:p>
-          <w:p>
-            <w:pPr>
-              <w:jc w:val="both"/>
-              <w:rPr>
-                <w:rFonts w:ascii="Calibri" w:hAnsi="Calibri"/>
-                <w:b/>
-                <w:bCs/>
-                <w:color w:val="1F4E79" w:themeColor="accent1" w:themeShade="80"/>
-              </w:rPr>
-            </w:pPr>
-          </w:p>
-          <w:p>
-            <w:pPr>
-              <w:jc w:val="both"/>
-              <w:rPr>
-                <w:rFonts w:ascii="Calibri" w:hAnsi="Calibri"/>
-                <w:b/>
-                <w:bCs/>
-                <w:color w:val="1F4E79" w:themeColor="accent1" w:themeShade="80"/>
-              </w:rPr>
-            </w:pPr>
-          </w:p>
-          <w:p>
-            <w:pPr>
-              <w:jc w:val="both"/>
-              <w:rPr>
-                <w:rFonts w:ascii="Calibri" w:hAnsi="Calibri"/>
-                <w:b/>
-                <w:bCs/>
-                <w:color w:val="1F4E79" w:themeColor="accent1" w:themeShade="80"/>
-              </w:rPr>
-            </w:pPr>
-          </w:p>
-          <w:p>
-            <w:pPr>
-              <w:jc w:val="both"/>
-              <w:rPr>
-                <w:rFonts w:ascii="Calibri" w:hAnsi="Calibri"/>
-                <w:b/>
-                <w:bCs/>
-                <w:color w:val="1F4E79" w:themeColor="accent1" w:themeShade="80"/>
-              </w:rPr>
-            </w:pPr>
-          </w:p>
-          <w:p>
-            <w:pPr>
-              <w:jc w:val="both"/>
-              <w:rPr>
-                <w:rFonts w:ascii="Calibri" w:hAnsi="Calibri"/>
-                <w:b/>
-                <w:bCs/>
-                <w:color w:val="1F4E79" w:themeColor="accent1" w:themeShade="80"/>
-              </w:rPr>
-            </w:pPr>
-          </w:p>
-          <w:p>
-            <w:pPr>
-              <w:jc w:val="both"/>
-              <w:rPr>
-                <w:rFonts w:ascii="Calibri" w:hAnsi="Calibri"/>
-                <w:b/>
-                <w:bCs/>
-                <w:color w:val="1F4E79" w:themeColor="accent1" w:themeShade="80"/>
-              </w:rPr>
-            </w:pPr>
-          </w:p>
-        </w:tc>
-      </w:tr>
-    </w:tbl>
-    <w:p>
-      <w:pPr>
-        <w:spacing w:after="0" w:line="360" w:lineRule="auto"/>
-        <w:jc w:val="both"/>
-        <w:rPr>
-          <w:color w:val="595959" w:themeColor="text1" w:themeTint="A6"/>
-          <w:sz w:val="24"/>
-          <w:szCs w:val="24"/>
-          <w:lang w:eastAsia="ja-JP"/>
-        </w:rPr>
-      </w:pPr>
-    </w:p>
-    <w:p>
-      <w:pPr>
-        <w:spacing w:after="0" w:line="360" w:lineRule="auto"/>
-        <w:jc w:val="both"/>
-        <w:rPr>
-          <w:b/>
-          <w:bCs/>
-          <w:sz w:val="24"/>
-          <w:szCs w:val="24"/>
-        </w:rPr>
-      </w:pPr>
-    </w:p>
-    <w:p>
-      <w:pPr>
-        <w:spacing w:after="0" w:line="360" w:lineRule="auto"/>
-        <w:jc w:val="both"/>
-        <w:rPr>
-          <w:b/>
-          <w:bCs/>
-          <w:sz w:val="24"/>
-          <w:szCs w:val="24"/>
-        </w:rPr>
-      </w:pPr>
-    </w:p>
-    <w:p>
-      <w:pPr>
-        <w:spacing w:after="0" w:line="360" w:lineRule="auto"/>
-        <w:jc w:val="both"/>
-        <w:rPr>
-          <w:b/>
-          <w:bCs/>
-          <w:sz w:val="24"/>
-          <w:szCs w:val="24"/>
-        </w:rPr>
-      </w:pPr>
-    </w:p>
-    <w:p>
-      <w:pPr>
-        <w:spacing w:after="0" w:line="360" w:lineRule="auto"/>
-        <w:jc w:val="both"/>
-        <w:rPr>
-          <w:b/>
-          <w:bCs/>
-          <w:sz w:val="24"/>
-          <w:szCs w:val="24"/>
-        </w:rPr>
-      </w:pPr>
-    </w:p>
-    <w:p>
-      <w:pPr>
-        <w:spacing w:after="0" w:line="360" w:lineRule="auto"/>
-        <w:jc w:val="both"/>
-        <w:rPr>
-          <w:b/>
-          <w:bCs/>
-          <w:sz w:val="24"/>
-          <w:szCs w:val="24"/>
-        </w:rPr>
-      </w:pPr>
-    </w:p>
-    <w:tbl>
-      <w:tblPr>
-        <w:tblStyle w:val="Tablaconcuadrcula"/>
-        <w:tblW w:w="0" w:type="auto"/>
-        <w:tblBorders>
-          <w:top w:val="single" w:sz="4" w:space="0" w:color="BFBFBF" w:themeColor="background1" w:themeShade="BF"/>
-          <w:left w:val="single" w:sz="4" w:space="0" w:color="BFBFBF" w:themeColor="background1" w:themeShade="BF"/>
-          <w:bottom w:val="single" w:sz="4" w:space="0" w:color="BFBFBF" w:themeColor="background1" w:themeShade="BF"/>
-          <w:right w:val="single" w:sz="4" w:space="0" w:color="BFBFBF" w:themeColor="background1" w:themeShade="BF"/>
-          <w:insideH w:val="single" w:sz="4" w:space="0" w:color="BFBFBF" w:themeColor="background1" w:themeShade="BF"/>
-          <w:insideV w:val="single" w:sz="4" w:space="0" w:color="BFBFBF" w:themeColor="background1" w:themeShade="BF"/>
-        </w:tblBorders>
-        <w:tblLook w:val="04A0" w:firstRow="1" w:lastRow="0" w:firstColumn="1" w:lastColumn="0" w:noHBand="0" w:noVBand="1"/>
-      </w:tblPr>
-      <w:tblGrid>
-        <w:gridCol w:w="10076"/>
-      </w:tblGrid>
-      <w:tr>
-        <w:trPr>
-          <w:trHeight w:val="440"/>
-        </w:trPr>
-        <w:tc>
-          <w:tcPr>
-            <w:tcW w:w="10076" w:type="dxa"/>
-            <w:vAlign w:val="center"/>
-          </w:tcPr>
-          <w:p>
-            <w:pPr>
-              <w:jc w:val="both"/>
-              <w:rPr>
-                <w:rFonts w:ascii="Century Gothic" w:hAnsi="Century Gothic"/>
-                <w:sz w:val="20"/>
-                <w:szCs w:val="20"/>
-              </w:rPr>
-            </w:pPr>
             <w:bookmarkStart w:id="0" w:name="_GoBack"/>
             <w:bookmarkEnd w:id="0"/>
-            <w:r>
-              <w:rPr>
-                <w:rFonts w:eastAsiaTheme="majorEastAsia"/>
-                <w:sz w:val="24"/>
-                <w:szCs w:val="24"/>
-              </w:rPr>
-              <w:t xml:space="preserve">4. Finalmente, piensa en el proyecto que desarrollarás en APT y responde a las siguientes preguntas: </w:t>
-            </w:r>
-          </w:p>
-        </w:tc>
-      </w:tr>
-      <w:tr>
-        <w:trPr>
-          <w:trHeight w:val="440"/>
-        </w:trPr>
-        <w:tc>
-          <w:tcPr>
-            <w:tcW w:w="10076" w:type="dxa"/>
-            <w:shd w:val="clear" w:color="auto" w:fill="DEEAF6" w:themeFill="accent1" w:themeFillTint="33"/>
-            <w:vAlign w:val="center"/>
-          </w:tcPr>
-          <w:p>
-            <w:pPr>
-              <w:rPr>
-                <w:rFonts w:eastAsiaTheme="majorEastAsia"/>
-                <w:color w:val="767171" w:themeColor="background2" w:themeShade="80"/>
-                <w:sz w:val="24"/>
-                <w:szCs w:val="24"/>
-              </w:rPr>
-            </w:pPr>
-          </w:p>
-          <w:p>
-            <w:pPr>
-              <w:pStyle w:val="Prrafodelista"/>
-              <w:numPr>
-                <w:ilvl w:val="0"/>
-                <w:numId w:val="12"/>
-              </w:numPr>
-              <w:tabs>
-                <w:tab w:val="left" w:pos="454"/>
-              </w:tabs>
-              <w:ind w:left="454" w:hanging="283"/>
-              <w:jc w:val="both"/>
-              <w:rPr>
-                <w:rFonts w:eastAsiaTheme="majorEastAsia"/>
-                <w:color w:val="767171" w:themeColor="background2" w:themeShade="80"/>
-                <w:sz w:val="24"/>
-                <w:szCs w:val="24"/>
-              </w:rPr>
-            </w:pPr>
-            <w:r>
-              <w:rPr>
-                <w:rFonts w:eastAsiaTheme="majorEastAsia"/>
-                <w:sz w:val="24"/>
-                <w:szCs w:val="24"/>
-              </w:rPr>
-              <w:t>Los Proyectos APT que ya habías diseñado como plan de trabajo en el curso anterior, ¿se relacionan con tus proyecciones profesionales actuales? ¿cuál se relaciona más? ¿Requiere ajuste?</w:t>
-            </w:r>
-          </w:p>
-          <w:p>
-            <w:pPr>
-              <w:tabs>
-                <w:tab w:val="left" w:pos="454"/>
-              </w:tabs>
-              <w:jc w:val="both"/>
-              <w:rPr>
-                <w:rFonts w:eastAsiaTheme="majorEastAsia"/>
-                <w:color w:val="767171" w:themeColor="background2" w:themeShade="80"/>
-                <w:sz w:val="24"/>
-                <w:szCs w:val="24"/>
-              </w:rPr>
-            </w:pPr>
-          </w:p>
-          <w:p>
-            <w:pPr>
-              <w:tabs>
-                <w:tab w:val="left" w:pos="454"/>
-              </w:tabs>
-              <w:jc w:val="both"/>
-              <w:rPr>
-                <w:rFonts w:eastAsiaTheme="majorEastAsia"/>
-                <w:color w:val="767171" w:themeColor="background2" w:themeShade="80"/>
-                <w:sz w:val="24"/>
-                <w:szCs w:val="24"/>
-              </w:rPr>
-            </w:pPr>
-          </w:p>
-          <w:p>
-            <w:pPr>
-              <w:tabs>
-                <w:tab w:val="left" w:pos="454"/>
-              </w:tabs>
-              <w:jc w:val="both"/>
-              <w:rPr>
-                <w:rFonts w:eastAsiaTheme="majorEastAsia"/>
-                <w:color w:val="767171" w:themeColor="background2" w:themeShade="80"/>
-                <w:sz w:val="24"/>
-                <w:szCs w:val="24"/>
-              </w:rPr>
-            </w:pPr>
-          </w:p>
-          <w:p>
-            <w:pPr>
-              <w:tabs>
-                <w:tab w:val="left" w:pos="454"/>
-              </w:tabs>
-              <w:jc w:val="both"/>
-              <w:rPr>
-                <w:rFonts w:eastAsiaTheme="majorEastAsia"/>
-                <w:color w:val="767171" w:themeColor="background2" w:themeShade="80"/>
-                <w:sz w:val="24"/>
-                <w:szCs w:val="24"/>
-              </w:rPr>
-            </w:pPr>
-          </w:p>
-          <w:p>
-            <w:pPr>
-              <w:tabs>
-                <w:tab w:val="left" w:pos="454"/>
-              </w:tabs>
-              <w:jc w:val="both"/>
-              <w:rPr>
-                <w:rFonts w:eastAsiaTheme="majorEastAsia"/>
-                <w:sz w:val="24"/>
-                <w:szCs w:val="24"/>
-              </w:rPr>
-            </w:pPr>
-          </w:p>
-          <w:p>
-            <w:pPr>
-              <w:tabs>
-                <w:tab w:val="left" w:pos="454"/>
-              </w:tabs>
-              <w:jc w:val="both"/>
-              <w:rPr>
-                <w:rFonts w:eastAsiaTheme="majorEastAsia"/>
-                <w:sz w:val="24"/>
-                <w:szCs w:val="24"/>
-              </w:rPr>
-            </w:pPr>
-          </w:p>
-          <w:p>
-            <w:pPr>
-              <w:tabs>
-                <w:tab w:val="left" w:pos="454"/>
-              </w:tabs>
-              <w:jc w:val="both"/>
-              <w:rPr>
-                <w:rFonts w:eastAsiaTheme="majorEastAsia"/>
-                <w:sz w:val="24"/>
-                <w:szCs w:val="24"/>
-              </w:rPr>
-            </w:pPr>
-          </w:p>
-          <w:p>
-            <w:pPr>
-              <w:tabs>
-                <w:tab w:val="left" w:pos="454"/>
-              </w:tabs>
-              <w:jc w:val="both"/>
-              <w:rPr>
-                <w:rFonts w:eastAsiaTheme="majorEastAsia"/>
-                <w:sz w:val="24"/>
-                <w:szCs w:val="24"/>
-              </w:rPr>
-            </w:pPr>
           </w:p>
           <w:p>
             <w:pPr>
@@ -2213,7 +2286,7 @@
 </file>
 
 <file path=word/endnotes.xml><?xml version="1.0" encoding="utf-8"?>
-<w:endnotes xmlns:wpc="http://schemas.microsoft.com/office/word/2010/wordprocessingCanvas" xmlns:cx="http://schemas.microsoft.com/office/drawing/2014/chartex" xmlns:mc="http://schemas.openxmlformats.org/markup-compatibility/2006" xmlns:o="urn:schemas-microsoft-com:office:office" xmlns:r="http://schemas.openxmlformats.org/officeDocument/2006/relationships" xmlns:m="http://schemas.openxmlformats.org/officeDocument/2006/math" xmlns:v="urn:schemas-microsoft-com:vml" xmlns:wp14="http://schemas.microsoft.com/office/word/2010/wordprocessingDrawing" xmlns:wp="http://schemas.openxmlformats.org/drawingml/2006/wordprocessingDrawing" xmlns:w10="urn:schemas-microsoft-com:office:word" xmlns:w="http://schemas.openxmlformats.org/wordprocessingml/2006/main" xmlns:w14="http://schemas.microsoft.com/office/word/2010/wordml" xmlns:w15="http://schemas.microsoft.com/office/word/2012/wordml" xmlns:w16se="http://schemas.microsoft.com/office/word/2015/wordml/symex" xmlns:wpg="http://schemas.microsoft.com/office/word/2010/wordprocessingGroup" xmlns:wpi="http://schemas.microsoft.com/office/word/2010/wordprocessingInk" xmlns:wne="http://schemas.microsoft.com/office/word/2006/wordml" xmlns:wps="http://schemas.microsoft.com/office/word/2010/wordprocessingShape" mc:Ignorable="w14 w15 w16se wp14">
+<w:endnotes xmlns:wpc="http://schemas.microsoft.com/office/word/2010/wordprocessingCanvas" xmlns:cx="http://schemas.microsoft.com/office/drawing/2014/chartex" xmlns:cx1="http://schemas.microsoft.com/office/drawing/2015/9/8/chartex" xmlns:mc="http://schemas.openxmlformats.org/markup-compatibility/2006" xmlns:o="urn:schemas-microsoft-com:office:office" xmlns:r="http://schemas.openxmlformats.org/officeDocument/2006/relationships" xmlns:m="http://schemas.openxmlformats.org/officeDocument/2006/math" xmlns:v="urn:schemas-microsoft-com:vml" xmlns:wp14="http://schemas.microsoft.com/office/word/2010/wordprocessingDrawing" xmlns:wp="http://schemas.openxmlformats.org/drawingml/2006/wordprocessingDrawing" xmlns:w10="urn:schemas-microsoft-com:office:word" xmlns:w="http://schemas.openxmlformats.org/wordprocessingml/2006/main" xmlns:w14="http://schemas.microsoft.com/office/word/2010/wordml" xmlns:w15="http://schemas.microsoft.com/office/word/2012/wordml" xmlns:w16se="http://schemas.microsoft.com/office/word/2015/wordml/symex" xmlns:wpg="http://schemas.microsoft.com/office/word/2010/wordprocessingGroup" xmlns:wpi="http://schemas.microsoft.com/office/word/2010/wordprocessingInk" xmlns:wne="http://schemas.microsoft.com/office/word/2006/wordml" xmlns:wps="http://schemas.microsoft.com/office/word/2010/wordprocessingShape" mc:Ignorable="w14 w15 w16se wp14">
   <w:endnote w:type="separator" w:id="-1">
     <w:p>
       <w:pPr>
@@ -2238,7 +2311,7 @@
 </file>
 
 <file path=word/footer1.xml><?xml version="1.0" encoding="utf-8"?>
-<w:ftr xmlns:wpc="http://schemas.microsoft.com/office/word/2010/wordprocessingCanvas" xmlns:cx="http://schemas.microsoft.com/office/drawing/2014/chartex" xmlns:mc="http://schemas.openxmlformats.org/markup-compatibility/2006" xmlns:o="urn:schemas-microsoft-com:office:office" xmlns:r="http://schemas.openxmlformats.org/officeDocument/2006/relationships" xmlns:m="http://schemas.openxmlformats.org/officeDocument/2006/math" xmlns:v="urn:schemas-microsoft-com:vml" xmlns:wp14="http://schemas.microsoft.com/office/word/2010/wordprocessingDrawing" xmlns:wp="http://schemas.openxmlformats.org/drawingml/2006/wordprocessingDrawing" xmlns:w10="urn:schemas-microsoft-com:office:word" xmlns:w="http://schemas.openxmlformats.org/wordprocessingml/2006/main" xmlns:w14="http://schemas.microsoft.com/office/word/2010/wordml" xmlns:w15="http://schemas.microsoft.com/office/word/2012/wordml" xmlns:w16se="http://schemas.microsoft.com/office/word/2015/wordml/symex" xmlns:wpg="http://schemas.microsoft.com/office/word/2010/wordprocessingGroup" xmlns:wpi="http://schemas.microsoft.com/office/word/2010/wordprocessingInk" xmlns:wne="http://schemas.microsoft.com/office/word/2006/wordml" xmlns:wps="http://schemas.microsoft.com/office/word/2010/wordprocessingShape" mc:Ignorable="w14 w15 w16se wp14">
+<w:ftr xmlns:wpc="http://schemas.microsoft.com/office/word/2010/wordprocessingCanvas" xmlns:cx="http://schemas.microsoft.com/office/drawing/2014/chartex" xmlns:cx1="http://schemas.microsoft.com/office/drawing/2015/9/8/chartex" xmlns:mc="http://schemas.openxmlformats.org/markup-compatibility/2006" xmlns:o="urn:schemas-microsoft-com:office:office" xmlns:r="http://schemas.openxmlformats.org/officeDocument/2006/relationships" xmlns:m="http://schemas.openxmlformats.org/officeDocument/2006/math" xmlns:v="urn:schemas-microsoft-com:vml" xmlns:wp14="http://schemas.microsoft.com/office/word/2010/wordprocessingDrawing" xmlns:wp="http://schemas.openxmlformats.org/drawingml/2006/wordprocessingDrawing" xmlns:w10="urn:schemas-microsoft-com:office:word" xmlns:w="http://schemas.openxmlformats.org/wordprocessingml/2006/main" xmlns:w14="http://schemas.microsoft.com/office/word/2010/wordml" xmlns:w15="http://schemas.microsoft.com/office/word/2012/wordml" xmlns:w16se="http://schemas.microsoft.com/office/word/2015/wordml/symex" xmlns:wpg="http://schemas.microsoft.com/office/word/2010/wordprocessingGroup" xmlns:wpi="http://schemas.microsoft.com/office/word/2010/wordprocessingInk" xmlns:wne="http://schemas.microsoft.com/office/word/2006/wordml" xmlns:wps="http://schemas.microsoft.com/office/word/2010/wordprocessingShape" mc:Ignorable="w14 w15 w16se wp14">
   <w:sdt>
     <w:sdtPr>
       <w:id w:val="-937982979"/>
@@ -2348,7 +2421,7 @@
                                     <w:color w:val="8C8C8C" w:themeColor="background1" w:themeShade="8C"/>
                                     <w:lang w:val="es-ES"/>
                                   </w:rPr>
-                                  <w:t>3</w:t>
+                                  <w:t>4</w:t>
                                 </w:r>
                                 <w:r>
                                   <w:rPr>
@@ -2486,7 +2559,7 @@
                               <w:color w:val="8C8C8C" w:themeColor="background1" w:themeShade="8C"/>
                               <w:lang w:val="es-ES"/>
                             </w:rPr>
-                            <w:t>3</w:t>
+                            <w:t>4</w:t>
                           </w:r>
                           <w:r>
                             <w:rPr>
@@ -2526,7 +2599,7 @@
 </file>
 
 <file path=word/footnotes.xml><?xml version="1.0" encoding="utf-8"?>
-<w:footnotes xmlns:wpc="http://schemas.microsoft.com/office/word/2010/wordprocessingCanvas" xmlns:cx="http://schemas.microsoft.com/office/drawing/2014/chartex" xmlns:mc="http://schemas.openxmlformats.org/markup-compatibility/2006" xmlns:o="urn:schemas-microsoft-com:office:office" xmlns:r="http://schemas.openxmlformats.org/officeDocument/2006/relationships" xmlns:m="http://schemas.openxmlformats.org/officeDocument/2006/math" xmlns:v="urn:schemas-microsoft-com:vml" xmlns:wp14="http://schemas.microsoft.com/office/word/2010/wordprocessingDrawing" xmlns:wp="http://schemas.openxmlformats.org/drawingml/2006/wordprocessingDrawing" xmlns:w10="urn:schemas-microsoft-com:office:word" xmlns:w="http://schemas.openxmlformats.org/wordprocessingml/2006/main" xmlns:w14="http://schemas.microsoft.com/office/word/2010/wordml" xmlns:w15="http://schemas.microsoft.com/office/word/2012/wordml" xmlns:w16se="http://schemas.microsoft.com/office/word/2015/wordml/symex" xmlns:wpg="http://schemas.microsoft.com/office/word/2010/wordprocessingGroup" xmlns:wpi="http://schemas.microsoft.com/office/word/2010/wordprocessingInk" xmlns:wne="http://schemas.microsoft.com/office/word/2006/wordml" xmlns:wps="http://schemas.microsoft.com/office/word/2010/wordprocessingShape" mc:Ignorable="w14 w15 w16se wp14">
+<w:footnotes xmlns:wpc="http://schemas.microsoft.com/office/word/2010/wordprocessingCanvas" xmlns:cx="http://schemas.microsoft.com/office/drawing/2014/chartex" xmlns:cx1="http://schemas.microsoft.com/office/drawing/2015/9/8/chartex" xmlns:mc="http://schemas.openxmlformats.org/markup-compatibility/2006" xmlns:o="urn:schemas-microsoft-com:office:office" xmlns:r="http://schemas.openxmlformats.org/officeDocument/2006/relationships" xmlns:m="http://schemas.openxmlformats.org/officeDocument/2006/math" xmlns:v="urn:schemas-microsoft-com:vml" xmlns:wp14="http://schemas.microsoft.com/office/word/2010/wordprocessingDrawing" xmlns:wp="http://schemas.openxmlformats.org/drawingml/2006/wordprocessingDrawing" xmlns:w10="urn:schemas-microsoft-com:office:word" xmlns:w="http://schemas.openxmlformats.org/wordprocessingml/2006/main" xmlns:w14="http://schemas.microsoft.com/office/word/2010/wordml" xmlns:w15="http://schemas.microsoft.com/office/word/2012/wordml" xmlns:w16se="http://schemas.microsoft.com/office/word/2015/wordml/symex" xmlns:wpg="http://schemas.microsoft.com/office/word/2010/wordprocessingGroup" xmlns:wpi="http://schemas.microsoft.com/office/word/2010/wordprocessingInk" xmlns:wne="http://schemas.microsoft.com/office/word/2006/wordml" xmlns:wps="http://schemas.microsoft.com/office/word/2010/wordprocessingShape" mc:Ignorable="w14 w15 w16se wp14">
   <w:footnote w:type="separator" w:id="-1">
     <w:p>
       <w:pPr>
@@ -2551,7 +2624,7 @@
 </file>
 
 <file path=word/header1.xml><?xml version="1.0" encoding="utf-8"?>
-<w:hdr xmlns:wpc="http://schemas.microsoft.com/office/word/2010/wordprocessingCanvas" xmlns:cx="http://schemas.microsoft.com/office/drawing/2014/chartex" xmlns:mc="http://schemas.openxmlformats.org/markup-compatibility/2006" xmlns:o="urn:schemas-microsoft-com:office:office" xmlns:r="http://schemas.openxmlformats.org/officeDocument/2006/relationships" xmlns:m="http://schemas.openxmlformats.org/officeDocument/2006/math" xmlns:v="urn:schemas-microsoft-com:vml" xmlns:wp14="http://schemas.microsoft.com/office/word/2010/wordprocessingDrawing" xmlns:wp="http://schemas.openxmlformats.org/drawingml/2006/wordprocessingDrawing" xmlns:w10="urn:schemas-microsoft-com:office:word" xmlns:w="http://schemas.openxmlformats.org/wordprocessingml/2006/main" xmlns:w14="http://schemas.microsoft.com/office/word/2010/wordml" xmlns:w15="http://schemas.microsoft.com/office/word/2012/wordml" xmlns:w16se="http://schemas.microsoft.com/office/word/2015/wordml/symex" xmlns:wpg="http://schemas.microsoft.com/office/word/2010/wordprocessingGroup" xmlns:wpi="http://schemas.microsoft.com/office/word/2010/wordprocessingInk" xmlns:wne="http://schemas.microsoft.com/office/word/2006/wordml" xmlns:wps="http://schemas.microsoft.com/office/word/2010/wordprocessingShape" mc:Ignorable="w14 w15 w16se wp14">
+<w:hdr xmlns:wpc="http://schemas.microsoft.com/office/word/2010/wordprocessingCanvas" xmlns:cx="http://schemas.microsoft.com/office/drawing/2014/chartex" xmlns:cx1="http://schemas.microsoft.com/office/drawing/2015/9/8/chartex" xmlns:mc="http://schemas.openxmlformats.org/markup-compatibility/2006" xmlns:o="urn:schemas-microsoft-com:office:office" xmlns:r="http://schemas.openxmlformats.org/officeDocument/2006/relationships" xmlns:m="http://schemas.openxmlformats.org/officeDocument/2006/math" xmlns:v="urn:schemas-microsoft-com:vml" xmlns:wp14="http://schemas.microsoft.com/office/word/2010/wordprocessingDrawing" xmlns:wp="http://schemas.openxmlformats.org/drawingml/2006/wordprocessingDrawing" xmlns:w10="urn:schemas-microsoft-com:office:word" xmlns:w="http://schemas.openxmlformats.org/wordprocessingml/2006/main" xmlns:w14="http://schemas.microsoft.com/office/word/2010/wordml" xmlns:w15="http://schemas.microsoft.com/office/word/2012/wordml" xmlns:w16se="http://schemas.microsoft.com/office/word/2015/wordml/symex" xmlns:wpg="http://schemas.microsoft.com/office/word/2010/wordprocessingGroup" xmlns:wpi="http://schemas.microsoft.com/office/word/2010/wordprocessingInk" xmlns:wne="http://schemas.microsoft.com/office/word/2006/wordml" xmlns:wps="http://schemas.microsoft.com/office/word/2010/wordprocessingShape" mc:Ignorable="w14 w15 w16se wp14">
   <w:tbl>
     <w:tblPr>
       <w:tblStyle w:val="Tablaconcuadrcula"/>
@@ -2721,7 +2794,7 @@
 </file>
 
 <file path=word/header2.xml><?xml version="1.0" encoding="utf-8"?>
-<w:hdr xmlns:wpc="http://schemas.microsoft.com/office/word/2010/wordprocessingCanvas" xmlns:cx="http://schemas.microsoft.com/office/drawing/2014/chartex" xmlns:mc="http://schemas.openxmlformats.org/markup-compatibility/2006" xmlns:o="urn:schemas-microsoft-com:office:office" xmlns:r="http://schemas.openxmlformats.org/officeDocument/2006/relationships" xmlns:m="http://schemas.openxmlformats.org/officeDocument/2006/math" xmlns:v="urn:schemas-microsoft-com:vml" xmlns:wp14="http://schemas.microsoft.com/office/word/2010/wordprocessingDrawing" xmlns:wp="http://schemas.openxmlformats.org/drawingml/2006/wordprocessingDrawing" xmlns:w10="urn:schemas-microsoft-com:office:word" xmlns:w="http://schemas.openxmlformats.org/wordprocessingml/2006/main" xmlns:w14="http://schemas.microsoft.com/office/word/2010/wordml" xmlns:w15="http://schemas.microsoft.com/office/word/2012/wordml" xmlns:w16se="http://schemas.microsoft.com/office/word/2015/wordml/symex" xmlns:wpg="http://schemas.microsoft.com/office/word/2010/wordprocessingGroup" xmlns:wpi="http://schemas.microsoft.com/office/word/2010/wordprocessingInk" xmlns:wne="http://schemas.microsoft.com/office/word/2006/wordml" xmlns:wps="http://schemas.microsoft.com/office/word/2010/wordprocessingShape" mc:Ignorable="w14 w15 w16se wp14">
+<w:hdr xmlns:wpc="http://schemas.microsoft.com/office/word/2010/wordprocessingCanvas" xmlns:cx="http://schemas.microsoft.com/office/drawing/2014/chartex" xmlns:cx1="http://schemas.microsoft.com/office/drawing/2015/9/8/chartex" xmlns:mc="http://schemas.openxmlformats.org/markup-compatibility/2006" xmlns:o="urn:schemas-microsoft-com:office:office" xmlns:r="http://schemas.openxmlformats.org/officeDocument/2006/relationships" xmlns:m="http://schemas.openxmlformats.org/officeDocument/2006/math" xmlns:v="urn:schemas-microsoft-com:vml" xmlns:wp14="http://schemas.microsoft.com/office/word/2010/wordprocessingDrawing" xmlns:wp="http://schemas.openxmlformats.org/drawingml/2006/wordprocessingDrawing" xmlns:w10="urn:schemas-microsoft-com:office:word" xmlns:w="http://schemas.openxmlformats.org/wordprocessingml/2006/main" xmlns:w14="http://schemas.microsoft.com/office/word/2010/wordml" xmlns:w15="http://schemas.microsoft.com/office/word/2012/wordml" xmlns:w16se="http://schemas.microsoft.com/office/word/2015/wordml/symex" xmlns:wpg="http://schemas.microsoft.com/office/word/2010/wordprocessingGroup" xmlns:wpi="http://schemas.microsoft.com/office/word/2010/wordprocessingInk" xmlns:wne="http://schemas.microsoft.com/office/word/2006/wordml" xmlns:wps="http://schemas.microsoft.com/office/word/2010/wordprocessingShape" mc:Ignorable="w14 w15 w16se wp14">
   <w:tbl>
     <w:tblPr>
       <w:tblStyle w:val="Tablaconcuadrcula"/>
@@ -2866,8 +2939,19 @@
               <w:sz w:val="24"/>
               <w:szCs w:val="24"/>
             </w:rPr>
-            <w:t>Técnico en Geomática</w:t>
+            <w:t xml:space="preserve">Técnico en </w:t>
           </w:r>
+          <w:proofErr w:type="spellStart"/>
+          <w:r>
+            <w:rPr>
+              <w:rFonts w:ascii="Century Gothic" w:eastAsia="Century Gothic" w:hAnsi="Century Gothic" w:cs="Century Gothic"/>
+              <w:color w:val="1D2763"/>
+              <w:sz w:val="24"/>
+              <w:szCs w:val="24"/>
+            </w:rPr>
+            <w:t>Geomática</w:t>
+          </w:r>
+          <w:proofErr w:type="spellEnd"/>
         </w:p>
         <w:p>
           <w:pPr>
@@ -2994,7 +3078,7 @@
 </file>
 
 <file path=word/numbering.xml><?xml version="1.0" encoding="utf-8"?>
-<w:numbering xmlns:wpc="http://schemas.microsoft.com/office/word/2010/wordprocessingCanvas" xmlns:cx="http://schemas.microsoft.com/office/drawing/2014/chartex" xmlns:mc="http://schemas.openxmlformats.org/markup-compatibility/2006" xmlns:o="urn:schemas-microsoft-com:office:office" xmlns:r="http://schemas.openxmlformats.org/officeDocument/2006/relationships" xmlns:m="http://schemas.openxmlformats.org/officeDocument/2006/math" xmlns:v="urn:schemas-microsoft-com:vml" xmlns:wp14="http://schemas.microsoft.com/office/word/2010/wordprocessingDrawing" xmlns:wp="http://schemas.openxmlformats.org/drawingml/2006/wordprocessingDrawing" xmlns:w10="urn:schemas-microsoft-com:office:word" xmlns:w="http://schemas.openxmlformats.org/wordprocessingml/2006/main" xmlns:w14="http://schemas.microsoft.com/office/word/2010/wordml" xmlns:w15="http://schemas.microsoft.com/office/word/2012/wordml" xmlns:w16se="http://schemas.microsoft.com/office/word/2015/wordml/symex" xmlns:wpg="http://schemas.microsoft.com/office/word/2010/wordprocessingGroup" xmlns:wpi="http://schemas.microsoft.com/office/word/2010/wordprocessingInk" xmlns:wne="http://schemas.microsoft.com/office/word/2006/wordml" xmlns:wps="http://schemas.microsoft.com/office/word/2010/wordprocessingShape" mc:Ignorable="w14 w15 w16se wp14">
+<w:numbering xmlns:wpc="http://schemas.microsoft.com/office/word/2010/wordprocessingCanvas" xmlns:cx="http://schemas.microsoft.com/office/drawing/2014/chartex" xmlns:cx1="http://schemas.microsoft.com/office/drawing/2015/9/8/chartex" xmlns:mc="http://schemas.openxmlformats.org/markup-compatibility/2006" xmlns:o="urn:schemas-microsoft-com:office:office" xmlns:r="http://schemas.openxmlformats.org/officeDocument/2006/relationships" xmlns:m="http://schemas.openxmlformats.org/officeDocument/2006/math" xmlns:v="urn:schemas-microsoft-com:vml" xmlns:wp14="http://schemas.microsoft.com/office/word/2010/wordprocessingDrawing" xmlns:wp="http://schemas.openxmlformats.org/drawingml/2006/wordprocessingDrawing" xmlns:w10="urn:schemas-microsoft-com:office:word" xmlns:w="http://schemas.openxmlformats.org/wordprocessingml/2006/main" xmlns:w14="http://schemas.microsoft.com/office/word/2010/wordml" xmlns:w15="http://schemas.microsoft.com/office/word/2012/wordml" xmlns:w16se="http://schemas.microsoft.com/office/word/2015/wordml/symex" xmlns:wpg="http://schemas.microsoft.com/office/word/2010/wordprocessingGroup" xmlns:wpi="http://schemas.microsoft.com/office/word/2010/wordprocessingInk" xmlns:wne="http://schemas.microsoft.com/office/word/2006/wordml" xmlns:wps="http://schemas.microsoft.com/office/word/2010/wordprocessingShape" mc:Ignorable="w14 w15 w16se wp14">
   <w:abstractNum w:abstractNumId="0" w15:restartNumberingAfterBreak="0">
     <w:nsid w:val="049156A1"/>
     <w:multiLevelType w:val="hybridMultilevel"/>
@@ -5305,6 +5389,118 @@
     </w:lvl>
   </w:abstractNum>
   <w:abstractNum w:abstractNumId="21" w15:restartNumberingAfterBreak="0">
+    <w:nsid w:val="437A5D31"/>
+    <w:multiLevelType w:val="hybridMultilevel"/>
+    <w:tmpl w:val="6B66B070"/>
+    <w:lvl w:ilvl="0" w:tplc="A7F04E3A">
+      <w:numFmt w:val="bullet"/>
+      <w:lvlText w:val="-"/>
+      <w:lvlJc w:val="left"/>
+      <w:pPr>
+        <w:ind w:left="720" w:hanging="360"/>
+      </w:pPr>
+      <w:rPr>
+        <w:rFonts w:ascii="Calibri" w:eastAsiaTheme="majorEastAsia" w:hAnsi="Calibri" w:cs="Calibri" w:hint="default"/>
+      </w:rPr>
+    </w:lvl>
+    <w:lvl w:ilvl="1" w:tplc="340A0003" w:tentative="1">
+      <w:start w:val="1"/>
+      <w:numFmt w:val="bullet"/>
+      <w:lvlText w:val="o"/>
+      <w:lvlJc w:val="left"/>
+      <w:pPr>
+        <w:ind w:left="1440" w:hanging="360"/>
+      </w:pPr>
+      <w:rPr>
+        <w:rFonts w:ascii="Courier New" w:hAnsi="Courier New" w:cs="Courier New" w:hint="default"/>
+      </w:rPr>
+    </w:lvl>
+    <w:lvl w:ilvl="2" w:tplc="340A0005" w:tentative="1">
+      <w:start w:val="1"/>
+      <w:numFmt w:val="bullet"/>
+      <w:lvlText w:val=""/>
+      <w:lvlJc w:val="left"/>
+      <w:pPr>
+        <w:ind w:left="2160" w:hanging="360"/>
+      </w:pPr>
+      <w:rPr>
+        <w:rFonts w:ascii="Wingdings" w:hAnsi="Wingdings" w:hint="default"/>
+      </w:rPr>
+    </w:lvl>
+    <w:lvl w:ilvl="3" w:tplc="340A0001" w:tentative="1">
+      <w:start w:val="1"/>
+      <w:numFmt w:val="bullet"/>
+      <w:lvlText w:val=""/>
+      <w:lvlJc w:val="left"/>
+      <w:pPr>
+        <w:ind w:left="2880" w:hanging="360"/>
+      </w:pPr>
+      <w:rPr>
+        <w:rFonts w:ascii="Symbol" w:hAnsi="Symbol" w:hint="default"/>
+      </w:rPr>
+    </w:lvl>
+    <w:lvl w:ilvl="4" w:tplc="340A0003" w:tentative="1">
+      <w:start w:val="1"/>
+      <w:numFmt w:val="bullet"/>
+      <w:lvlText w:val="o"/>
+      <w:lvlJc w:val="left"/>
+      <w:pPr>
+        <w:ind w:left="3600" w:hanging="360"/>
+      </w:pPr>
+      <w:rPr>
+        <w:rFonts w:ascii="Courier New" w:hAnsi="Courier New" w:cs="Courier New" w:hint="default"/>
+      </w:rPr>
+    </w:lvl>
+    <w:lvl w:ilvl="5" w:tplc="340A0005" w:tentative="1">
+      <w:start w:val="1"/>
+      <w:numFmt w:val="bullet"/>
+      <w:lvlText w:val=""/>
+      <w:lvlJc w:val="left"/>
+      <w:pPr>
+        <w:ind w:left="4320" w:hanging="360"/>
+      </w:pPr>
+      <w:rPr>
+        <w:rFonts w:ascii="Wingdings" w:hAnsi="Wingdings" w:hint="default"/>
+      </w:rPr>
+    </w:lvl>
+    <w:lvl w:ilvl="6" w:tplc="340A0001" w:tentative="1">
+      <w:start w:val="1"/>
+      <w:numFmt w:val="bullet"/>
+      <w:lvlText w:val=""/>
+      <w:lvlJc w:val="left"/>
+      <w:pPr>
+        <w:ind w:left="5040" w:hanging="360"/>
+      </w:pPr>
+      <w:rPr>
+        <w:rFonts w:ascii="Symbol" w:hAnsi="Symbol" w:hint="default"/>
+      </w:rPr>
+    </w:lvl>
+    <w:lvl w:ilvl="7" w:tplc="340A0003" w:tentative="1">
+      <w:start w:val="1"/>
+      <w:numFmt w:val="bullet"/>
+      <w:lvlText w:val="o"/>
+      <w:lvlJc w:val="left"/>
+      <w:pPr>
+        <w:ind w:left="5760" w:hanging="360"/>
+      </w:pPr>
+      <w:rPr>
+        <w:rFonts w:ascii="Courier New" w:hAnsi="Courier New" w:cs="Courier New" w:hint="default"/>
+      </w:rPr>
+    </w:lvl>
+    <w:lvl w:ilvl="8" w:tplc="340A0005" w:tentative="1">
+      <w:start w:val="1"/>
+      <w:numFmt w:val="bullet"/>
+      <w:lvlText w:val=""/>
+      <w:lvlJc w:val="left"/>
+      <w:pPr>
+        <w:ind w:left="6480" w:hanging="360"/>
+      </w:pPr>
+      <w:rPr>
+        <w:rFonts w:ascii="Wingdings" w:hAnsi="Wingdings" w:hint="default"/>
+      </w:rPr>
+    </w:lvl>
+  </w:abstractNum>
+  <w:abstractNum w:abstractNumId="22" w15:restartNumberingAfterBreak="0">
     <w:nsid w:val="44F11BDD"/>
     <w:multiLevelType w:val="hybridMultilevel"/>
     <w:tmpl w:val="3F5AF554"/>
@@ -5417,7 +5613,7 @@
       </w:rPr>
     </w:lvl>
   </w:abstractNum>
-  <w:abstractNum w:abstractNumId="22" w15:restartNumberingAfterBreak="0">
+  <w:abstractNum w:abstractNumId="23" w15:restartNumberingAfterBreak="0">
     <w:nsid w:val="4FE12D10"/>
     <w:multiLevelType w:val="hybridMultilevel"/>
     <w:tmpl w:val="1550181C"/>
@@ -5530,7 +5726,7 @@
       </w:rPr>
     </w:lvl>
   </w:abstractNum>
-  <w:abstractNum w:abstractNumId="23" w15:restartNumberingAfterBreak="0">
+  <w:abstractNum w:abstractNumId="24" w15:restartNumberingAfterBreak="0">
     <w:nsid w:val="50C131BC"/>
     <w:multiLevelType w:val="hybridMultilevel"/>
     <w:tmpl w:val="8FDC567E"/>
@@ -5643,7 +5839,7 @@
       </w:rPr>
     </w:lvl>
   </w:abstractNum>
-  <w:abstractNum w:abstractNumId="24" w15:restartNumberingAfterBreak="0">
+  <w:abstractNum w:abstractNumId="25" w15:restartNumberingAfterBreak="0">
     <w:nsid w:val="510E5C01"/>
     <w:multiLevelType w:val="multilevel"/>
     <w:tmpl w:val="BC9C1F48"/>
@@ -5756,7 +5952,7 @@
       </w:rPr>
     </w:lvl>
   </w:abstractNum>
-  <w:abstractNum w:abstractNumId="25" w15:restartNumberingAfterBreak="0">
+  <w:abstractNum w:abstractNumId="26" w15:restartNumberingAfterBreak="0">
     <w:nsid w:val="5C463542"/>
     <w:multiLevelType w:val="multilevel"/>
     <w:tmpl w:val="C3E4949E"/>
@@ -5905,7 +6101,7 @@
       </w:rPr>
     </w:lvl>
   </w:abstractNum>
-  <w:abstractNum w:abstractNumId="26" w15:restartNumberingAfterBreak="0">
+  <w:abstractNum w:abstractNumId="27" w15:restartNumberingAfterBreak="0">
     <w:nsid w:val="64E91BB3"/>
     <w:multiLevelType w:val="multilevel"/>
     <w:tmpl w:val="A672F762"/>
@@ -6054,7 +6250,7 @@
       </w:rPr>
     </w:lvl>
   </w:abstractNum>
-  <w:abstractNum w:abstractNumId="27" w15:restartNumberingAfterBreak="0">
+  <w:abstractNum w:abstractNumId="28" w15:restartNumberingAfterBreak="0">
     <w:nsid w:val="6ADA0051"/>
     <w:multiLevelType w:val="multilevel"/>
     <w:tmpl w:val="C806233A"/>
@@ -6203,7 +6399,7 @@
       </w:rPr>
     </w:lvl>
   </w:abstractNum>
-  <w:abstractNum w:abstractNumId="28" w15:restartNumberingAfterBreak="0">
+  <w:abstractNum w:abstractNumId="29" w15:restartNumberingAfterBreak="0">
     <w:nsid w:val="6BDB0362"/>
     <w:multiLevelType w:val="hybridMultilevel"/>
     <w:tmpl w:val="8106327E"/>
@@ -6292,7 +6488,7 @@
       </w:pPr>
     </w:lvl>
   </w:abstractNum>
-  <w:abstractNum w:abstractNumId="29" w15:restartNumberingAfterBreak="0">
+  <w:abstractNum w:abstractNumId="30" w15:restartNumberingAfterBreak="0">
     <w:nsid w:val="6F3C13F9"/>
     <w:multiLevelType w:val="hybridMultilevel"/>
     <w:tmpl w:val="B40CE148"/>
@@ -6405,7 +6601,7 @@
       </w:rPr>
     </w:lvl>
   </w:abstractNum>
-  <w:abstractNum w:abstractNumId="30" w15:restartNumberingAfterBreak="0">
+  <w:abstractNum w:abstractNumId="31" w15:restartNumberingAfterBreak="0">
     <w:nsid w:val="6F5F64B1"/>
     <w:multiLevelType w:val="hybridMultilevel"/>
     <w:tmpl w:val="999C60C0"/>
@@ -6494,7 +6690,7 @@
       </w:pPr>
     </w:lvl>
   </w:abstractNum>
-  <w:abstractNum w:abstractNumId="31" w15:restartNumberingAfterBreak="0">
+  <w:abstractNum w:abstractNumId="32" w15:restartNumberingAfterBreak="0">
     <w:nsid w:val="731E1176"/>
     <w:multiLevelType w:val="hybridMultilevel"/>
     <w:tmpl w:val="5846EECC"/>
@@ -6583,7 +6779,7 @@
       </w:pPr>
     </w:lvl>
   </w:abstractNum>
-  <w:abstractNum w:abstractNumId="32" w15:restartNumberingAfterBreak="0">
+  <w:abstractNum w:abstractNumId="33" w15:restartNumberingAfterBreak="0">
     <w:nsid w:val="74565F7A"/>
     <w:multiLevelType w:val="multilevel"/>
     <w:tmpl w:val="36B8B0EE"/>
@@ -6732,7 +6928,7 @@
       </w:rPr>
     </w:lvl>
   </w:abstractNum>
-  <w:abstractNum w:abstractNumId="33" w15:restartNumberingAfterBreak="0">
+  <w:abstractNum w:abstractNumId="34" w15:restartNumberingAfterBreak="0">
     <w:nsid w:val="74F525A0"/>
     <w:multiLevelType w:val="hybridMultilevel"/>
     <w:tmpl w:val="6E2889E8"/>
@@ -6845,7 +7041,7 @@
       </w:rPr>
     </w:lvl>
   </w:abstractNum>
-  <w:abstractNum w:abstractNumId="34" w15:restartNumberingAfterBreak="0">
+  <w:abstractNum w:abstractNumId="35" w15:restartNumberingAfterBreak="0">
     <w:nsid w:val="78261542"/>
     <w:multiLevelType w:val="hybridMultilevel"/>
     <w:tmpl w:val="93C21CAE"/>
@@ -6958,7 +7154,7 @@
       </w:rPr>
     </w:lvl>
   </w:abstractNum>
-  <w:abstractNum w:abstractNumId="35" w15:restartNumberingAfterBreak="0">
+  <w:abstractNum w:abstractNumId="36" w15:restartNumberingAfterBreak="0">
     <w:nsid w:val="7A044B22"/>
     <w:multiLevelType w:val="hybridMultilevel"/>
     <w:tmpl w:val="5D9A3082"/>
@@ -7071,7 +7267,7 @@
       </w:rPr>
     </w:lvl>
   </w:abstractNum>
-  <w:abstractNum w:abstractNumId="36" w15:restartNumberingAfterBreak="0">
+  <w:abstractNum w:abstractNumId="37" w15:restartNumberingAfterBreak="0">
     <w:nsid w:val="7AB36760"/>
     <w:multiLevelType w:val="hybridMultilevel"/>
     <w:tmpl w:val="2A60134C"/>
@@ -7157,7 +7353,7 @@
       </w:pPr>
     </w:lvl>
   </w:abstractNum>
-  <w:abstractNum w:abstractNumId="37" w15:restartNumberingAfterBreak="0">
+  <w:abstractNum w:abstractNumId="38" w15:restartNumberingAfterBreak="0">
     <w:nsid w:val="7B9B44FE"/>
     <w:multiLevelType w:val="multilevel"/>
     <w:tmpl w:val="06565EEA"/>
@@ -7306,7 +7502,7 @@
       </w:rPr>
     </w:lvl>
   </w:abstractNum>
-  <w:abstractNum w:abstractNumId="38" w15:restartNumberingAfterBreak="0">
+  <w:abstractNum w:abstractNumId="39" w15:restartNumberingAfterBreak="0">
     <w:nsid w:val="7DBB548A"/>
     <w:multiLevelType w:val="multilevel"/>
     <w:tmpl w:val="D5CA36FE"/>
@@ -7455,7 +7651,7 @@
       </w:rPr>
     </w:lvl>
   </w:abstractNum>
-  <w:abstractNum w:abstractNumId="39" w15:restartNumberingAfterBreak="0">
+  <w:abstractNum w:abstractNumId="40" w15:restartNumberingAfterBreak="0">
     <w:nsid w:val="7F291C01"/>
     <w:multiLevelType w:val="hybridMultilevel"/>
     <w:tmpl w:val="19B0EB20"/>
@@ -7578,10 +7774,10 @@
     <w:abstractNumId w:val="12"/>
   </w:num>
   <w:num w:numId="4">
-    <w:abstractNumId w:val="28"/>
+    <w:abstractNumId w:val="29"/>
   </w:num>
   <w:num w:numId="5">
-    <w:abstractNumId w:val="30"/>
+    <w:abstractNumId w:val="31"/>
   </w:num>
   <w:num w:numId="6">
     <w:abstractNumId w:val="4"/>
@@ -7599,37 +7795,37 @@
     <w:abstractNumId w:val="9"/>
   </w:num>
   <w:num w:numId="11">
-    <w:abstractNumId w:val="24"/>
+    <w:abstractNumId w:val="25"/>
   </w:num>
   <w:num w:numId="12">
-    <w:abstractNumId w:val="35"/>
+    <w:abstractNumId w:val="36"/>
   </w:num>
   <w:num w:numId="13">
-    <w:abstractNumId w:val="29"/>
+    <w:abstractNumId w:val="30"/>
   </w:num>
   <w:num w:numId="14">
     <w:abstractNumId w:val="1"/>
   </w:num>
   <w:num w:numId="15">
-    <w:abstractNumId w:val="36"/>
+    <w:abstractNumId w:val="37"/>
   </w:num>
   <w:num w:numId="16">
-    <w:abstractNumId w:val="21"/>
+    <w:abstractNumId w:val="22"/>
   </w:num>
   <w:num w:numId="17">
     <w:abstractNumId w:val="17"/>
   </w:num>
   <w:num w:numId="18">
-    <w:abstractNumId w:val="31"/>
+    <w:abstractNumId w:val="32"/>
   </w:num>
   <w:num w:numId="19">
     <w:abstractNumId w:val="10"/>
   </w:num>
   <w:num w:numId="20">
-    <w:abstractNumId w:val="39"/>
+    <w:abstractNumId w:val="40"/>
   </w:num>
   <w:num w:numId="21">
-    <w:abstractNumId w:val="34"/>
+    <w:abstractNumId w:val="35"/>
   </w:num>
   <w:num w:numId="22">
     <w:abstractNumId w:val="13"/>
@@ -7647,7 +7843,7 @@
     <w:abstractNumId w:val="20"/>
   </w:num>
   <w:num w:numId="27">
-    <w:abstractNumId w:val="23"/>
+    <w:abstractNumId w:val="24"/>
   </w:num>
   <w:num w:numId="28">
     <w:abstractNumId w:val="0"/>
@@ -7656,7 +7852,7 @@
     <w:abstractNumId w:val="18"/>
   </w:num>
   <w:num w:numId="30">
-    <w:abstractNumId w:val="22"/>
+    <w:abstractNumId w:val="23"/>
   </w:num>
   <w:num w:numId="31">
     <w:abstractNumId w:val="2"/>
@@ -7665,28 +7861,31 @@
     <w:abstractNumId w:val="7"/>
   </w:num>
   <w:num w:numId="33">
-    <w:abstractNumId w:val="32"/>
+    <w:abstractNumId w:val="33"/>
   </w:num>
   <w:num w:numId="34">
-    <w:abstractNumId w:val="38"/>
+    <w:abstractNumId w:val="39"/>
   </w:num>
   <w:num w:numId="35">
     <w:abstractNumId w:val="6"/>
   </w:num>
   <w:num w:numId="36">
-    <w:abstractNumId w:val="25"/>
+    <w:abstractNumId w:val="26"/>
   </w:num>
   <w:num w:numId="37">
-    <w:abstractNumId w:val="37"/>
+    <w:abstractNumId w:val="38"/>
   </w:num>
   <w:num w:numId="38">
+    <w:abstractNumId w:val="28"/>
+  </w:num>
+  <w:num w:numId="39">
     <w:abstractNumId w:val="27"/>
   </w:num>
-  <w:num w:numId="39">
-    <w:abstractNumId w:val="26"/>
+  <w:num w:numId="40">
+    <w:abstractNumId w:val="34"/>
   </w:num>
-  <w:num w:numId="40">
-    <w:abstractNumId w:val="33"/>
+  <w:num w:numId="41">
+    <w:abstractNumId w:val="21"/>
   </w:num>
   <w:numIdMacAtCleanup w:val="18"/>
 </w:numbering>
@@ -9138,533 +9337,21 @@
       <w:bCs/>
     </w:rPr>
   </w:style>
-</w:styles>
-</file>
-
-<file path=word/glossary/document.xml><?xml version="1.0" encoding="utf-8"?>
-<w:glossaryDocument xmlns:wpc="http://schemas.microsoft.com/office/word/2010/wordprocessingCanvas" xmlns:cx="http://schemas.microsoft.com/office/drawing/2014/chartex" xmlns:mc="http://schemas.openxmlformats.org/markup-compatibility/2006" xmlns:o="urn:schemas-microsoft-com:office:office" xmlns:r="http://schemas.openxmlformats.org/officeDocument/2006/relationships" xmlns:m="http://schemas.openxmlformats.org/officeDocument/2006/math" xmlns:v="urn:schemas-microsoft-com:vml" xmlns:wp14="http://schemas.microsoft.com/office/word/2010/wordprocessingDrawing" xmlns:wp="http://schemas.openxmlformats.org/drawingml/2006/wordprocessingDrawing" xmlns:w10="urn:schemas-microsoft-com:office:word" xmlns:w="http://schemas.openxmlformats.org/wordprocessingml/2006/main" xmlns:w14="http://schemas.microsoft.com/office/word/2010/wordml" xmlns:w15="http://schemas.microsoft.com/office/word/2012/wordml" xmlns:w16se="http://schemas.microsoft.com/office/word/2015/wordml/symex" xmlns:wpg="http://schemas.microsoft.com/office/word/2010/wordprocessingGroup" xmlns:wpi="http://schemas.microsoft.com/office/word/2010/wordprocessingInk" xmlns:wne="http://schemas.microsoft.com/office/word/2006/wordml" xmlns:wps="http://schemas.microsoft.com/office/word/2010/wordprocessingShape" mc:Ignorable="w14 w15 w16se wp14"/>
-</file>
-
-<file path=word/glossary/fontTable.xml><?xml version="1.0" encoding="utf-8"?>
-<w:fonts xmlns:mc="http://schemas.openxmlformats.org/markup-compatibility/2006" xmlns:r="http://schemas.openxmlformats.org/officeDocument/2006/relationships" xmlns:w="http://schemas.openxmlformats.org/wordprocessingml/2006/main" xmlns:w14="http://schemas.microsoft.com/office/word/2010/wordml" xmlns:w15="http://schemas.microsoft.com/office/word/2012/wordml" xmlns:w16se="http://schemas.microsoft.com/office/word/2015/wordml/symex" mc:Ignorable="w14 w15 w16se">
-  <w:font w:name="Calibri">
-    <w:panose1 w:val="020F0502020204030204"/>
-    <w:charset w:val="00"/>
-    <w:family w:val="swiss"/>
-    <w:pitch w:val="variable"/>
-    <w:sig w:usb0="E4002EFF" w:usb1="C000247B" w:usb2="00000009" w:usb3="00000000" w:csb0="000001FF" w:csb1="00000000"/>
-  </w:font>
-  <w:font w:name="Times New Roman">
-    <w:panose1 w:val="02020603050405020304"/>
-    <w:charset w:val="00"/>
-    <w:family w:val="roman"/>
-    <w:pitch w:val="variable"/>
-    <w:sig w:usb0="E0002EFF" w:usb1="C000785B" w:usb2="00000009" w:usb3="00000000" w:csb0="000001FF" w:csb1="00000000"/>
-  </w:font>
-  <w:font w:name="Courier New">
-    <w:panose1 w:val="02070309020205020404"/>
-    <w:charset w:val="00"/>
-    <w:family w:val="modern"/>
-    <w:pitch w:val="fixed"/>
-    <w:sig w:usb0="E0002EFF" w:usb1="C0007843" w:usb2="00000009" w:usb3="00000000" w:csb0="000001FF" w:csb1="00000000"/>
-  </w:font>
-  <w:font w:name="Wingdings">
-    <w:panose1 w:val="05000000000000000000"/>
-    <w:charset w:val="02"/>
-    <w:family w:val="auto"/>
-    <w:pitch w:val="variable"/>
-    <w:sig w:usb0="00000000" w:usb1="10000000" w:usb2="00000000" w:usb3="00000000" w:csb0="80000000" w:csb1="00000000"/>
-  </w:font>
-  <w:font w:name="Symbol">
-    <w:panose1 w:val="05050102010706020507"/>
-    <w:charset w:val="02"/>
-    <w:family w:val="roman"/>
-    <w:pitch w:val="variable"/>
-    <w:sig w:usb0="00000000" w:usb1="10000000" w:usb2="00000000" w:usb3="00000000" w:csb0="80000000" w:csb1="00000000"/>
-  </w:font>
-  <w:font w:name="Calibri Light">
-    <w:panose1 w:val="020F0302020204030204"/>
-    <w:charset w:val="00"/>
-    <w:family w:val="swiss"/>
-    <w:pitch w:val="variable"/>
-    <w:sig w:usb0="E4002EFF" w:usb1="C000247B" w:usb2="00000009" w:usb3="00000000" w:csb0="000001FF" w:csb1="00000000"/>
-  </w:font>
-  <w:font w:name="Segoe UI">
-    <w:panose1 w:val="020B0502040204020203"/>
-    <w:charset w:val="00"/>
-    <w:family w:val="swiss"/>
-    <w:pitch w:val="variable"/>
-    <w:sig w:usb0="E4002EFF" w:usb1="C000E47F" w:usb2="00000009" w:usb3="00000000" w:csb0="000001FF" w:csb1="00000000"/>
-  </w:font>
-  <w:font w:name="Century Gothic">
-    <w:panose1 w:val="020B0502020202020204"/>
-    <w:charset w:val="00"/>
-    <w:family w:val="swiss"/>
-    <w:pitch w:val="variable"/>
-    <w:sig w:usb0="00000287" w:usb1="00000000" w:usb2="00000000" w:usb3="00000000" w:csb0="0000009F" w:csb1="00000000"/>
-  </w:font>
-</w:fonts>
-</file>
-
-<file path=word/glossary/settings.xml><?xml version="1.0" encoding="utf-8"?>
-<w:settings xmlns:mc="http://schemas.openxmlformats.org/markup-compatibility/2006" xmlns:o="urn:schemas-microsoft-com:office:office" xmlns:r="http://schemas.openxmlformats.org/officeDocument/2006/relationships" xmlns:m="http://schemas.openxmlformats.org/officeDocument/2006/math" xmlns:v="urn:schemas-microsoft-com:vml" xmlns:w10="urn:schemas-microsoft-com:office:word" xmlns:w="http://schemas.openxmlformats.org/wordprocessingml/2006/main" xmlns:w14="http://schemas.microsoft.com/office/word/2010/wordml" xmlns:w15="http://schemas.microsoft.com/office/word/2012/wordml" xmlns:w16se="http://schemas.microsoft.com/office/word/2015/wordml/symex" xmlns:sl="http://schemas.openxmlformats.org/schemaLibrary/2006/main" mc:Ignorable="w14 w15 w16se">
-  <w:defaultTabStop w:val="708"/>
-  <w:hyphenationZone w:val="425"/>
-  <w:characterSpacingControl w:val="doNotCompress"/>
-  <w:compat>
-    <w:useFELayout/>
-    <w:compatSetting w:name="compatibilityMode" w:uri="http://schemas.microsoft.com/office/word" w:val="12"/>
-  </w:compat>
-  <w:rsids>
-    <w:rsidRoot w:val="004A7892"/>
-    <w:rsid w:val="004A7892"/>
-  </w:rsids>
-  <m:mathPr>
-    <m:mathFont m:val="Cambria Math"/>
-    <m:brkBin m:val="before"/>
-    <m:brkBinSub m:val="--"/>
-    <m:smallFrac m:val="0"/>
-    <m:dispDef/>
-    <m:lMargin m:val="0"/>
-    <m:rMargin m:val="0"/>
-    <m:defJc m:val="centerGroup"/>
-    <m:wrapIndent m:val="1440"/>
-    <m:intLim m:val="subSup"/>
-    <m:naryLim m:val="undOvr"/>
-  </m:mathPr>
-  <w:themeFontLang w:val="es-CL"/>
-  <w:clrSchemeMapping w:bg1="light1" w:t1="dark1" w:bg2="light2" w:t2="dark2" w:accent1="accent1" w:accent2="accent2" w:accent3="accent3" w:accent4="accent4" w:accent5="accent5" w:accent6="accent6" w:hyperlink="hyperlink" w:followedHyperlink="followedHyperlink"/>
-  <w:decimalSymbol w:val=","/>
-  <w:listSeparator w:val=";"/>
-</w:settings>
-</file>
-
-<file path=word/glossary/styles.xml><?xml version="1.0" encoding="utf-8"?>
-<w:styles xmlns:mc="http://schemas.openxmlformats.org/markup-compatibility/2006" xmlns:r="http://schemas.openxmlformats.org/officeDocument/2006/relationships" xmlns:w="http://schemas.openxmlformats.org/wordprocessingml/2006/main" xmlns:w14="http://schemas.microsoft.com/office/word/2010/wordml" xmlns:w15="http://schemas.microsoft.com/office/word/2012/wordml" xmlns:w16se="http://schemas.microsoft.com/office/word/2015/wordml/symex" mc:Ignorable="w14 w15 w16se">
-  <w:docDefaults>
-    <w:rPrDefault>
-      <w:rPr>
-        <w:rFonts w:asciiTheme="minorHAnsi" w:eastAsiaTheme="minorEastAsia" w:hAnsiTheme="minorHAnsi" w:cstheme="minorBidi"/>
-        <w:sz w:val="22"/>
-        <w:szCs w:val="22"/>
-        <w:lang w:val="es-CL" w:eastAsia="es-CL" w:bidi="ar-SA"/>
-      </w:rPr>
-    </w:rPrDefault>
-    <w:pPrDefault>
-      <w:pPr>
-        <w:spacing w:after="160" w:line="259" w:lineRule="auto"/>
-      </w:pPr>
-    </w:pPrDefault>
-  </w:docDefaults>
-  <w:latentStyles w:defLockedState="0" w:defUIPriority="99" w:defSemiHidden="0" w:defUnhideWhenUsed="0" w:defQFormat="0" w:count="371">
-    <w:lsdException w:name="Normal" w:uiPriority="0" w:qFormat="1"/>
-    <w:lsdException w:name="heading 1" w:uiPriority="9" w:qFormat="1"/>
-    <w:lsdException w:name="heading 2" w:semiHidden="1" w:uiPriority="9" w:unhideWhenUsed="1" w:qFormat="1"/>
-    <w:lsdException w:name="heading 3" w:semiHidden="1" w:uiPriority="9" w:unhideWhenUsed="1" w:qFormat="1"/>
-    <w:lsdException w:name="heading 4" w:semiHidden="1" w:uiPriority="9" w:unhideWhenUsed="1" w:qFormat="1"/>
-    <w:lsdException w:name="heading 5" w:semiHidden="1" w:uiPriority="9" w:unhideWhenUsed="1" w:qFormat="1"/>
-    <w:lsdException w:name="heading 6" w:semiHidden="1" w:uiPriority="9" w:unhideWhenUsed="1" w:qFormat="1"/>
-    <w:lsdException w:name="heading 7" w:semiHidden="1" w:uiPriority="9" w:unhideWhenUsed="1" w:qFormat="1"/>
-    <w:lsdException w:name="heading 8" w:semiHidden="1" w:uiPriority="9" w:unhideWhenUsed="1" w:qFormat="1"/>
-    <w:lsdException w:name="heading 9" w:semiHidden="1" w:uiPriority="9" w:unhideWhenUsed="1" w:qFormat="1"/>
-    <w:lsdException w:name="index 1" w:semiHidden="1" w:unhideWhenUsed="1"/>
-    <w:lsdException w:name="index 2" w:semiHidden="1" w:unhideWhenUsed="1"/>
-    <w:lsdException w:name="index 3" w:semiHidden="1" w:unhideWhenUsed="1"/>
-    <w:lsdException w:name="index 4" w:semiHidden="1" w:unhideWhenUsed="1"/>
-    <w:lsdException w:name="index 5" w:semiHidden="1" w:unhideWhenUsed="1"/>
-    <w:lsdException w:name="index 6" w:semiHidden="1" w:unhideWhenUsed="1"/>
-    <w:lsdException w:name="index 7" w:semiHidden="1" w:unhideWhenUsed="1"/>
-    <w:lsdException w:name="index 8" w:semiHidden="1" w:unhideWhenUsed="1"/>
-    <w:lsdException w:name="index 9" w:semiHidden="1" w:unhideWhenUsed="1"/>
-    <w:lsdException w:name="toc 1" w:semiHidden="1" w:uiPriority="39" w:unhideWhenUsed="1"/>
-    <w:lsdException w:name="toc 2" w:semiHidden="1" w:uiPriority="39" w:unhideWhenUsed="1"/>
-    <w:lsdException w:name="toc 3" w:semiHidden="1" w:uiPriority="39" w:unhideWhenUsed="1"/>
-    <w:lsdException w:name="toc 4" w:semiHidden="1" w:uiPriority="39" w:unhideWhenUsed="1"/>
-    <w:lsdException w:name="toc 5" w:semiHidden="1" w:uiPriority="39" w:unhideWhenUsed="1"/>
-    <w:lsdException w:name="toc 6" w:semiHidden="1" w:uiPriority="39" w:unhideWhenUsed="1"/>
-    <w:lsdException w:name="toc 7" w:semiHidden="1" w:uiPriority="39" w:unhideWhenUsed="1"/>
-    <w:lsdException w:name="toc 8" w:semiHidden="1" w:uiPriority="39" w:unhideWhenUsed="1"/>
-    <w:lsdException w:name="toc 9" w:semiHidden="1" w:uiPriority="39" w:unhideWhenUsed="1"/>
-    <w:lsdException w:name="Normal Indent" w:semiHidden="1" w:unhideWhenUsed="1"/>
-    <w:lsdException w:name="footnote text" w:semiHidden="1" w:unhideWhenUsed="1"/>
-    <w:lsdException w:name="annotation text" w:semiHidden="1" w:unhideWhenUsed="1"/>
-    <w:lsdException w:name="header" w:semiHidden="1" w:unhideWhenUsed="1"/>
-    <w:lsdException w:name="footer" w:semiHidden="1" w:unhideWhenUsed="1"/>
-    <w:lsdException w:name="index heading" w:semiHidden="1" w:unhideWhenUsed="1"/>
-    <w:lsdException w:name="caption" w:semiHidden="1" w:uiPriority="35" w:unhideWhenUsed="1" w:qFormat="1"/>
-    <w:lsdException w:name="table of figures" w:semiHidden="1" w:unhideWhenUsed="1"/>
-    <w:lsdException w:name="envelope address" w:semiHidden="1" w:unhideWhenUsed="1"/>
-    <w:lsdException w:name="envelope return" w:semiHidden="1" w:unhideWhenUsed="1"/>
-    <w:lsdException w:name="footnote reference" w:semiHidden="1" w:unhideWhenUsed="1"/>
-    <w:lsdException w:name="annotation reference" w:semiHidden="1" w:unhideWhenUsed="1"/>
-    <w:lsdException w:name="line number" w:semiHidden="1" w:unhideWhenUsed="1"/>
-    <w:lsdException w:name="page number" w:semiHidden="1" w:unhideWhenUsed="1"/>
-    <w:lsdException w:name="endnote reference" w:semiHidden="1" w:unhideWhenUsed="1"/>
-    <w:lsdException w:name="endnote text" w:semiHidden="1" w:unhideWhenUsed="1"/>
-    <w:lsdException w:name="table of authorities" w:semiHidden="1" w:unhideWhenUsed="1"/>
-    <w:lsdException w:name="macro" w:semiHidden="1" w:unhideWhenUsed="1"/>
-    <w:lsdException w:name="toa heading" w:semiHidden="1" w:unhideWhenUsed="1"/>
-    <w:lsdException w:name="List" w:semiHidden="1" w:unhideWhenUsed="1"/>
-    <w:lsdException w:name="List Bullet" w:semiHidden="1" w:unhideWhenUsed="1"/>
-    <w:lsdException w:name="List Number" w:semiHidden="1" w:unhideWhenUsed="1"/>
-    <w:lsdException w:name="List 2" w:semiHidden="1" w:unhideWhenUsed="1"/>
-    <w:lsdException w:name="List 3" w:semiHidden="1" w:unhideWhenUsed="1"/>
-    <w:lsdException w:name="List 4" w:semiHidden="1" w:unhideWhenUsed="1"/>
-    <w:lsdException w:name="List 5" w:semiHidden="1" w:unhideWhenUsed="1"/>
-    <w:lsdException w:name="List Bullet 2" w:semiHidden="1" w:unhideWhenUsed="1"/>
-    <w:lsdException w:name="List Bullet 3" w:semiHidden="1" w:unhideWhenUsed="1"/>
-    <w:lsdException w:name="List Bullet 4" w:semiHidden="1" w:unhideWhenUsed="1"/>
-    <w:lsdException w:name="List Bullet 5" w:semiHidden="1" w:unhideWhenUsed="1"/>
-    <w:lsdException w:name="List Number 2" w:semiHidden="1" w:unhideWhenUsed="1"/>
-    <w:lsdException w:name="List Number 3" w:semiHidden="1" w:unhideWhenUsed="1"/>
-    <w:lsdException w:name="List Number 4" w:semiHidden="1" w:unhideWhenUsed="1"/>
-    <w:lsdException w:name="List Number 5" w:semiHidden="1" w:unhideWhenUsed="1"/>
-    <w:lsdException w:name="Title" w:uiPriority="10" w:qFormat="1"/>
-    <w:lsdException w:name="Closing" w:semiHidden="1" w:unhideWhenUsed="1"/>
-    <w:lsdException w:name="Signature" w:semiHidden="1" w:unhideWhenUsed="1"/>
-    <w:lsdException w:name="Default Paragraph Font" w:semiHidden="1" w:uiPriority="1" w:unhideWhenUsed="1"/>
-    <w:lsdException w:name="Body Text" w:semiHidden="1" w:unhideWhenUsed="1"/>
-    <w:lsdException w:name="Body Text Indent" w:semiHidden="1" w:unhideWhenUsed="1"/>
-    <w:lsdException w:name="List Continue" w:semiHidden="1" w:unhideWhenUsed="1"/>
-    <w:lsdException w:name="List Continue 2" w:semiHidden="1" w:unhideWhenUsed="1"/>
-    <w:lsdException w:name="List Continue 3" w:semiHidden="1" w:unhideWhenUsed="1"/>
-    <w:lsdException w:name="List Continue 4" w:semiHidden="1" w:unhideWhenUsed="1"/>
-    <w:lsdException w:name="List Continue 5" w:semiHidden="1" w:unhideWhenUsed="1"/>
-    <w:lsdException w:name="Message Header" w:semiHidden="1" w:unhideWhenUsed="1"/>
-    <w:lsdException w:name="Subtitle" w:uiPriority="11" w:qFormat="1"/>
-    <w:lsdException w:name="Salutation" w:semiHidden="1" w:unhideWhenUsed="1"/>
-    <w:lsdException w:name="Date" w:semiHidden="1" w:unhideWhenUsed="1"/>
-    <w:lsdException w:name="Body Text First Indent" w:semiHidden="1" w:unhideWhenUsed="1"/>
-    <w:lsdException w:name="Body Text First Indent 2" w:semiHidden="1" w:unhideWhenUsed="1"/>
-    <w:lsdException w:name="Note Heading" w:semiHidden="1" w:unhideWhenUsed="1"/>
-    <w:lsdException w:name="Body Text 2" w:semiHidden="1" w:unhideWhenUsed="1"/>
-    <w:lsdException w:name="Body Text 3" w:semiHidden="1" w:unhideWhenUsed="1"/>
-    <w:lsdException w:name="Body Text Indent 2" w:semiHidden="1" w:unhideWhenUsed="1"/>
-    <w:lsdException w:name="Body Text Indent 3" w:semiHidden="1" w:unhideWhenUsed="1"/>
-    <w:lsdException w:name="Block Text" w:semiHidden="1" w:unhideWhenUsed="1"/>
-    <w:lsdException w:name="Hyperlink" w:semiHidden="1" w:unhideWhenUsed="1"/>
-    <w:lsdException w:name="FollowedHyperlink" w:semiHidden="1" w:unhideWhenUsed="1"/>
-    <w:lsdException w:name="Strong" w:uiPriority="22" w:qFormat="1"/>
-    <w:lsdException w:name="Emphasis" w:uiPriority="20" w:qFormat="1"/>
-    <w:lsdException w:name="Document Map" w:semiHidden="1" w:unhideWhenUsed="1"/>
-    <w:lsdException w:name="Plain Text" w:semiHidden="1" w:unhideWhenUsed="1"/>
-    <w:lsdException w:name="E-mail Signature" w:semiHidden="1" w:unhideWhenUsed="1"/>
-    <w:lsdException w:name="HTML Top of Form" w:semiHidden="1" w:unhideWhenUsed="1"/>
-    <w:lsdException w:name="HTML Bottom of Form" w:semiHidden="1" w:unhideWhenUsed="1"/>
-    <w:lsdException w:name="Normal (Web)" w:semiHidden="1" w:unhideWhenUsed="1"/>
-    <w:lsdException w:name="HTML Acronym" w:semiHidden="1" w:unhideWhenUsed="1"/>
-    <w:lsdException w:name="HTML Address" w:semiHidden="1" w:unhideWhenUsed="1"/>
-    <w:lsdException w:name="HTML Cite" w:semiHidden="1" w:unhideWhenUsed="1"/>
-    <w:lsdException w:name="HTML Code" w:semiHidden="1" w:unhideWhenUsed="1"/>
-    <w:lsdException w:name="HTML Definition" w:semiHidden="1" w:unhideWhenUsed="1"/>
-    <w:lsdException w:name="HTML Keyboard" w:semiHidden="1" w:unhideWhenUsed="1"/>
-    <w:lsdException w:name="HTML Preformatted" w:semiHidden="1" w:unhideWhenUsed="1"/>
-    <w:lsdException w:name="HTML Sample" w:semiHidden="1" w:unhideWhenUsed="1"/>
-    <w:lsdException w:name="HTML Typewriter" w:semiHidden="1" w:unhideWhenUsed="1"/>
-    <w:lsdException w:name="HTML Variable" w:semiHidden="1" w:unhideWhenUsed="1"/>
-    <w:lsdException w:name="Normal Table" w:semiHidden="1" w:unhideWhenUsed="1"/>
-    <w:lsdException w:name="annotation subject" w:semiHidden="1" w:unhideWhenUsed="1"/>
-    <w:lsdException w:name="No List" w:semiHidden="1" w:unhideWhenUsed="1"/>
-    <w:lsdException w:name="Outline List 1" w:semiHidden="1" w:unhideWhenUsed="1"/>
-    <w:lsdException w:name="Outline List 2" w:semiHidden="1" w:unhideWhenUsed="1"/>
-    <w:lsdException w:name="Outline List 3" w:semiHidden="1" w:unhideWhenUsed="1"/>
-    <w:lsdException w:name="Table Simple 1" w:semiHidden="1" w:unhideWhenUsed="1"/>
-    <w:lsdException w:name="Table Simple 2" w:semiHidden="1" w:unhideWhenUsed="1"/>
-    <w:lsdException w:name="Table Simple 3" w:semiHidden="1" w:unhideWhenUsed="1"/>
-    <w:lsdException w:name="Table Classic 1" w:semiHidden="1" w:unhideWhenUsed="1"/>
-    <w:lsdException w:name="Table Classic 2" w:semiHidden="1" w:unhideWhenUsed="1"/>
-    <w:lsdException w:name="Table Classic 3" w:semiHidden="1" w:unhideWhenUsed="1"/>
-    <w:lsdException w:name="Table Classic 4" w:semiHidden="1" w:unhideWhenUsed="1"/>
-    <w:lsdException w:name="Table Colorful 1" w:semiHidden="1" w:unhideWhenUsed="1"/>
-    <w:lsdException w:name="Table Colorful 2" w:semiHidden="1" w:unhideWhenUsed="1"/>
-    <w:lsdException w:name="Table Colorful 3" w:semiHidden="1" w:unhideWhenUsed="1"/>
-    <w:lsdException w:name="Table Columns 1" w:semiHidden="1" w:unhideWhenUsed="1"/>
-    <w:lsdException w:name="Table Columns 2" w:semiHidden="1" w:unhideWhenUsed="1"/>
-    <w:lsdException w:name="Table Columns 3" w:semiHidden="1" w:unhideWhenUsed="1"/>
-    <w:lsdException w:name="Table Columns 4" w:semiHidden="1" w:unhideWhenUsed="1"/>
-    <w:lsdException w:name="Table Columns 5" w:semiHidden="1" w:unhideWhenUsed="1"/>
-    <w:lsdException w:name="Table Grid 1" w:semiHidden="1" w:unhideWhenUsed="1"/>
-    <w:lsdException w:name="Table Grid 2" w:semiHidden="1" w:unhideWhenUsed="1"/>
-    <w:lsdException w:name="Table Grid 3" w:semiHidden="1" w:unhideWhenUsed="1"/>
-    <w:lsdException w:name="Table Grid 4" w:semiHidden="1" w:unhideWhenUsed="1"/>
-    <w:lsdException w:name="Table Grid 5" w:semiHidden="1" w:unhideWhenUsed="1"/>
-    <w:lsdException w:name="Table Grid 6" w:semiHidden="1" w:unhideWhenUsed="1"/>
-    <w:lsdException w:name="Table Grid 7" w:semiHidden="1" w:unhideWhenUsed="1"/>
-    <w:lsdException w:name="Table Grid 8" w:semiHidden="1" w:unhideWhenUsed="1"/>
-    <w:lsdException w:name="Table List 1" w:semiHidden="1" w:unhideWhenUsed="1"/>
-    <w:lsdException w:name="Table List 2" w:semiHidden="1" w:unhideWhenUsed="1"/>
-    <w:lsdException w:name="Table List 3" w:semiHidden="1" w:unhideWhenUsed="1"/>
-    <w:lsdException w:name="Table List 4" w:semiHidden="1" w:unhideWhenUsed="1"/>
-    <w:lsdException w:name="Table List 5" w:semiHidden="1" w:unhideWhenUsed="1"/>
-    <w:lsdException w:name="Table List 6" w:semiHidden="1" w:unhideWhenUsed="1"/>
-    <w:lsdException w:name="Table List 7" w:semiHidden="1" w:unhideWhenUsed="1"/>
-    <w:lsdException w:name="Table List 8" w:semiHidden="1" w:unhideWhenUsed="1"/>
-    <w:lsdException w:name="Table 3D effects 1" w:semiHidden="1" w:unhideWhenUsed="1"/>
-    <w:lsdException w:name="Table 3D effects 2" w:semiHidden="1" w:unhideWhenUsed="1"/>
-    <w:lsdException w:name="Table 3D effects 3" w:semiHidden="1" w:unhideWhenUsed="1"/>
-    <w:lsdException w:name="Table Contemporary" w:semiHidden="1" w:unhideWhenUsed="1"/>
-    <w:lsdException w:name="Table Elegant" w:semiHidden="1" w:unhideWhenUsed="1"/>
-    <w:lsdException w:name="Table Professional" w:semiHidden="1" w:unhideWhenUsed="1"/>
-    <w:lsdException w:name="Table Subtle 1" w:semiHidden="1" w:unhideWhenUsed="1"/>
-    <w:lsdException w:name="Table Subtle 2" w:semiHidden="1" w:unhideWhenUsed="1"/>
-    <w:lsdException w:name="Table Web 1" w:semiHidden="1" w:unhideWhenUsed="1"/>
-    <w:lsdException w:name="Table Web 2" w:semiHidden="1" w:unhideWhenUsed="1"/>
-    <w:lsdException w:name="Table Web 3" w:semiHidden="1" w:unhideWhenUsed="1"/>
-    <w:lsdException w:name="Balloon Text" w:semiHidden="1" w:unhideWhenUsed="1"/>
-    <w:lsdException w:name="Table Grid" w:uiPriority="39"/>
-    <w:lsdException w:name="Table Theme" w:semiHidden="1" w:unhideWhenUsed="1"/>
-    <w:lsdException w:name="Placeholder Text" w:semiHidden="1"/>
-    <w:lsdException w:name="No Spacing" w:uiPriority="1" w:qFormat="1"/>
-    <w:lsdException w:name="Light Shading" w:uiPriority="60"/>
-    <w:lsdException w:name="Light List" w:uiPriority="61"/>
-    <w:lsdException w:name="Light Grid" w:uiPriority="62"/>
-    <w:lsdException w:name="Medium Shading 1" w:uiPriority="63"/>
-    <w:lsdException w:name="Medium Shading 2" w:uiPriority="64"/>
-    <w:lsdException w:name="Medium List 1" w:uiPriority="65"/>
-    <w:lsdException w:name="Medium List 2" w:uiPriority="66"/>
-    <w:lsdException w:name="Medium Grid 1" w:uiPriority="67"/>
-    <w:lsdException w:name="Medium Grid 2" w:uiPriority="68"/>
-    <w:lsdException w:name="Medium Grid 3" w:uiPriority="69"/>
-    <w:lsdException w:name="Dark List" w:uiPriority="70"/>
-    <w:lsdException w:name="Colorful Shading" w:uiPriority="71"/>
-    <w:lsdException w:name="Colorful List" w:uiPriority="72"/>
-    <w:lsdException w:name="Colorful Grid" w:uiPriority="73"/>
-    <w:lsdException w:name="Light Shading Accent 1" w:uiPriority="60"/>
-    <w:lsdException w:name="Light List Accent 1" w:uiPriority="61"/>
-    <w:lsdException w:name="Light Grid Accent 1" w:uiPriority="62"/>
-    <w:lsdException w:name="Medium Shading 1 Accent 1" w:uiPriority="63"/>
-    <w:lsdException w:name="Medium Shading 2 Accent 1" w:uiPriority="64"/>
-    <w:lsdException w:name="Medium List 1 Accent 1" w:uiPriority="65"/>
-    <w:lsdException w:name="Revision" w:semiHidden="1"/>
-    <w:lsdException w:name="List Paragraph" w:uiPriority="34" w:qFormat="1"/>
-    <w:lsdException w:name="Quote" w:uiPriority="29" w:qFormat="1"/>
-    <w:lsdException w:name="Intense Quote" w:uiPriority="30" w:qFormat="1"/>
-    <w:lsdException w:name="Medium List 2 Accent 1" w:uiPriority="66"/>
-    <w:lsdException w:name="Medium Grid 1 Accent 1" w:uiPriority="67"/>
-    <w:lsdException w:name="Medium Grid 2 Accent 1" w:uiPriority="68"/>
-    <w:lsdException w:name="Medium Grid 3 Accent 1" w:uiPriority="69"/>
-    <w:lsdException w:name="Dark List Accent 1" w:uiPriority="70"/>
-    <w:lsdException w:name="Colorful Shading Accent 1" w:uiPriority="71"/>
-    <w:lsdException w:name="Colorful List Accent 1" w:uiPriority="72"/>
-    <w:lsdException w:name="Colorful Grid Accent 1" w:uiPriority="73"/>
-    <w:lsdException w:name="Light Shading Accent 2" w:uiPriority="60"/>
-    <w:lsdException w:name="Light List Accent 2" w:uiPriority="61"/>
-    <w:lsdException w:name="Light Grid Accent 2" w:uiPriority="62"/>
-    <w:lsdException w:name="Medium Shading 1 Accent 2" w:uiPriority="63"/>
-    <w:lsdException w:name="Medium Shading 2 Accent 2" w:uiPriority="64"/>
-    <w:lsdException w:name="Medium List 1 Accent 2" w:uiPriority="65"/>
-    <w:lsdException w:name="Medium List 2 Accent 2" w:uiPriority="66"/>
-    <w:lsdException w:name="Medium Grid 1 Accent 2" w:uiPriority="67"/>
-    <w:lsdException w:name="Medium Grid 2 Accent 2" w:uiPriority="68"/>
-    <w:lsdException w:name="Medium Grid 3 Accent 2" w:uiPriority="69"/>
-    <w:lsdException w:name="Dark List Accent 2" w:uiPriority="70"/>
-    <w:lsdException w:name="Colorful Shading Accent 2" w:uiPriority="71"/>
-    <w:lsdException w:name="Colorful List Accent 2" w:uiPriority="72"/>
-    <w:lsdException w:name="Colorful Grid Accent 2" w:uiPriority="73"/>
-    <w:lsdException w:name="Light Shading Accent 3" w:uiPriority="60"/>
-    <w:lsdException w:name="Light List Accent 3" w:uiPriority="61"/>
-    <w:lsdException w:name="Light Grid Accent 3" w:uiPriority="62"/>
-    <w:lsdException w:name="Medium Shading 1 Accent 3" w:uiPriority="63"/>
-    <w:lsdException w:name="Medium Shading 2 Accent 3" w:uiPriority="64"/>
-    <w:lsdException w:name="Medium List 1 Accent 3" w:uiPriority="65"/>
-    <w:lsdException w:name="Medium List 2 Accent 3" w:uiPriority="66"/>
-    <w:lsdException w:name="Medium Grid 1 Accent 3" w:uiPriority="67"/>
-    <w:lsdException w:name="Medium Grid 2 Accent 3" w:uiPriority="68"/>
-    <w:lsdException w:name="Medium Grid 3 Accent 3" w:uiPriority="69"/>
-    <w:lsdException w:name="Dark List Accent 3" w:uiPriority="70"/>
-    <w:lsdException w:name="Colorful Shading Accent 3" w:uiPriority="71"/>
-    <w:lsdException w:name="Colorful List Accent 3" w:uiPriority="72"/>
-    <w:lsdException w:name="Colorful Grid Accent 3" w:uiPriority="73"/>
-    <w:lsdException w:name="Light Shading Accent 4" w:uiPriority="60"/>
-    <w:lsdException w:name="Light List Accent 4" w:uiPriority="61"/>
-    <w:lsdException w:name="Light Grid Accent 4" w:uiPriority="62"/>
-    <w:lsdException w:name="Medium Shading 1 Accent 4" w:uiPriority="63"/>
-    <w:lsdException w:name="Medium Shading 2 Accent 4" w:uiPriority="64"/>
-    <w:lsdException w:name="Medium List 1 Accent 4" w:uiPriority="65"/>
-    <w:lsdException w:name="Medium List 2 Accent 4" w:uiPriority="66"/>
-    <w:lsdException w:name="Medium Grid 1 Accent 4" w:uiPriority="67"/>
-    <w:lsdException w:name="Medium Grid 2 Accent 4" w:uiPriority="68"/>
-    <w:lsdException w:name="Medium Grid 3 Accent 4" w:uiPriority="69"/>
-    <w:lsdException w:name="Dark List Accent 4" w:uiPriority="70"/>
-    <w:lsdException w:name="Colorful Shading Accent 4" w:uiPriority="71"/>
-    <w:lsdException w:name="Colorful List Accent 4" w:uiPriority="72"/>
-    <w:lsdException w:name="Colorful Grid Accent 4" w:uiPriority="73"/>
-    <w:lsdException w:name="Light Shading Accent 5" w:uiPriority="60"/>
-    <w:lsdException w:name="Light List Accent 5" w:uiPriority="61"/>
-    <w:lsdException w:name="Light Grid Accent 5" w:uiPriority="62"/>
-    <w:lsdException w:name="Medium Shading 1 Accent 5" w:uiPriority="63"/>
-    <w:lsdException w:name="Medium Shading 2 Accent 5" w:uiPriority="64"/>
-    <w:lsdException w:name="Medium List 1 Accent 5" w:uiPriority="65"/>
-    <w:lsdException w:name="Medium List 2 Accent 5" w:uiPriority="66"/>
-    <w:lsdException w:name="Medium Grid 1 Accent 5" w:uiPriority="67"/>
-    <w:lsdException w:name="Medium Grid 2 Accent 5" w:uiPriority="68"/>
-    <w:lsdException w:name="Medium Grid 3 Accent 5" w:uiPriority="69"/>
-    <w:lsdException w:name="Dark List Accent 5" w:uiPriority="70"/>
-    <w:lsdException w:name="Colorful Shading Accent 5" w:uiPriority="71"/>
-    <w:lsdException w:name="Colorful List Accent 5" w:uiPriority="72"/>
-    <w:lsdException w:name="Colorful Grid Accent 5" w:uiPriority="73"/>
-    <w:lsdException w:name="Light Shading Accent 6" w:uiPriority="60"/>
-    <w:lsdException w:name="Light List Accent 6" w:uiPriority="61"/>
-    <w:lsdException w:name="Light Grid Accent 6" w:uiPriority="62"/>
-    <w:lsdException w:name="Medium Shading 1 Accent 6" w:uiPriority="63"/>
-    <w:lsdException w:name="Medium Shading 2 Accent 6" w:uiPriority="64"/>
-    <w:lsdException w:name="Medium List 1 Accent 6" w:uiPriority="65"/>
-    <w:lsdException w:name="Medium List 2 Accent 6" w:uiPriority="66"/>
-    <w:lsdException w:name="Medium Grid 1 Accent 6" w:uiPriority="67"/>
-    <w:lsdException w:name="Medium Grid 2 Accent 6" w:uiPriority="68"/>
-    <w:lsdException w:name="Medium Grid 3 Accent 6" w:uiPriority="69"/>
-    <w:lsdException w:name="Dark List Accent 6" w:uiPriority="70"/>
-    <w:lsdException w:name="Colorful Shading Accent 6" w:uiPriority="71"/>
-    <w:lsdException w:name="Colorful List Accent 6" w:uiPriority="72"/>
-    <w:lsdException w:name="Colorful Grid Accent 6" w:uiPriority="73"/>
-    <w:lsdException w:name="Subtle Emphasis" w:uiPriority="19" w:qFormat="1"/>
-    <w:lsdException w:name="Intense Emphasis" w:uiPriority="21" w:qFormat="1"/>
-    <w:lsdException w:name="Subtle Reference" w:uiPriority="31" w:qFormat="1"/>
-    <w:lsdException w:name="Intense Reference" w:uiPriority="32" w:qFormat="1"/>
-    <w:lsdException w:name="Book Title" w:uiPriority="33" w:qFormat="1"/>
-    <w:lsdException w:name="Bibliography" w:semiHidden="1" w:uiPriority="37" w:unhideWhenUsed="1"/>
-    <w:lsdException w:name="TOC Heading" w:semiHidden="1" w:uiPriority="39" w:unhideWhenUsed="1" w:qFormat="1"/>
-    <w:lsdException w:name="Plain Table 1" w:uiPriority="41"/>
-    <w:lsdException w:name="Plain Table 2" w:uiPriority="42"/>
-    <w:lsdException w:name="Plain Table 3" w:uiPriority="43"/>
-    <w:lsdException w:name="Plain Table 4" w:uiPriority="44"/>
-    <w:lsdException w:name="Plain Table 5" w:uiPriority="45"/>
-    <w:lsdException w:name="Grid Table Light" w:uiPriority="40"/>
-    <w:lsdException w:name="Grid Table 1 Light" w:uiPriority="46"/>
-    <w:lsdException w:name="Grid Table 2" w:uiPriority="47"/>
-    <w:lsdException w:name="Grid Table 3" w:uiPriority="48"/>
-    <w:lsdException w:name="Grid Table 4" w:uiPriority="49"/>
-    <w:lsdException w:name="Grid Table 5 Dark" w:uiPriority="50"/>
-    <w:lsdException w:name="Grid Table 6 Colorful" w:uiPriority="51"/>
-    <w:lsdException w:name="Grid Table 7 Colorful" w:uiPriority="52"/>
-    <w:lsdException w:name="Grid Table 1 Light Accent 1" w:uiPriority="46"/>
-    <w:lsdException w:name="Grid Table 2 Accent 1" w:uiPriority="47"/>
-    <w:lsdException w:name="Grid Table 3 Accent 1" w:uiPriority="48"/>
-    <w:lsdException w:name="Grid Table 4 Accent 1" w:uiPriority="49"/>
-    <w:lsdException w:name="Grid Table 5 Dark Accent 1" w:uiPriority="50"/>
-    <w:lsdException w:name="Grid Table 6 Colorful Accent 1" w:uiPriority="51"/>
-    <w:lsdException w:name="Grid Table 7 Colorful Accent 1" w:uiPriority="52"/>
-    <w:lsdException w:name="Grid Table 1 Light Accent 2" w:uiPriority="46"/>
-    <w:lsdException w:name="Grid Table 2 Accent 2" w:uiPriority="47"/>
-    <w:lsdException w:name="Grid Table 3 Accent 2" w:uiPriority="48"/>
-    <w:lsdException w:name="Grid Table 4 Accent 2" w:uiPriority="49"/>
-    <w:lsdException w:name="Grid Table 5 Dark Accent 2" w:uiPriority="50"/>
-    <w:lsdException w:name="Grid Table 6 Colorful Accent 2" w:uiPriority="51"/>
-    <w:lsdException w:name="Grid Table 7 Colorful Accent 2" w:uiPriority="52"/>
-    <w:lsdException w:name="Grid Table 1 Light Accent 3" w:uiPriority="46"/>
-    <w:lsdException w:name="Grid Table 2 Accent 3" w:uiPriority="47"/>
-    <w:lsdException w:name="Grid Table 3 Accent 3" w:uiPriority="48"/>
-    <w:lsdException w:name="Grid Table 4 Accent 3" w:uiPriority="49"/>
-    <w:lsdException w:name="Grid Table 5 Dark Accent 3" w:uiPriority="50"/>
-    <w:lsdException w:name="Grid Table 6 Colorful Accent 3" w:uiPriority="51"/>
-    <w:lsdException w:name="Grid Table 7 Colorful Accent 3" w:uiPriority="52"/>
-    <w:lsdException w:name="Grid Table 1 Light Accent 4" w:uiPriority="46"/>
-    <w:lsdException w:name="Grid Table 2 Accent 4" w:uiPriority="47"/>
-    <w:lsdException w:name="Grid Table 3 Accent 4" w:uiPriority="48"/>
-    <w:lsdException w:name="Grid Table 4 Accent 4" w:uiPriority="49"/>
-    <w:lsdException w:name="Grid Table 5 Dark Accent 4" w:uiPriority="50"/>
-    <w:lsdException w:name="Grid Table 6 Colorful Accent 4" w:uiPriority="51"/>
-    <w:lsdException w:name="Grid Table 7 Colorful Accent 4" w:uiPriority="52"/>
-    <w:lsdException w:name="Grid Table 1 Light Accent 5" w:uiPriority="46"/>
-    <w:lsdException w:name="Grid Table 2 Accent 5" w:uiPriority="47"/>
-    <w:lsdException w:name="Grid Table 3 Accent 5" w:uiPriority="48"/>
-    <w:lsdException w:name="Grid Table 4 Accent 5" w:uiPriority="49"/>
-    <w:lsdException w:name="Grid Table 5 Dark Accent 5" w:uiPriority="50"/>
-    <w:lsdException w:name="Grid Table 6 Colorful Accent 5" w:uiPriority="51"/>
-    <w:lsdException w:name="Grid Table 7 Colorful Accent 5" w:uiPriority="52"/>
-    <w:lsdException w:name="Grid Table 1 Light Accent 6" w:uiPriority="46"/>
-    <w:lsdException w:name="Grid Table 2 Accent 6" w:uiPriority="47"/>
-    <w:lsdException w:name="Grid Table 3 Accent 6" w:uiPriority="48"/>
-    <w:lsdException w:name="Grid Table 4 Accent 6" w:uiPriority="49"/>
-    <w:lsdException w:name="Grid Table 5 Dark Accent 6" w:uiPriority="50"/>
-    <w:lsdException w:name="Grid Table 6 Colorful Accent 6" w:uiPriority="51"/>
-    <w:lsdException w:name="Grid Table 7 Colorful Accent 6" w:uiPriority="52"/>
-    <w:lsdException w:name="List Table 1 Light" w:uiPriority="46"/>
-    <w:lsdException w:name="List Table 2" w:uiPriority="47"/>
-    <w:lsdException w:name="List Table 3" w:uiPriority="48"/>
-    <w:lsdException w:name="List Table 4" w:uiPriority="49"/>
-    <w:lsdException w:name="List Table 5 Dark" w:uiPriority="50"/>
-    <w:lsdException w:name="List Table 6 Colorful" w:uiPriority="51"/>
-    <w:lsdException w:name="List Table 7 Colorful" w:uiPriority="52"/>
-    <w:lsdException w:name="List Table 1 Light Accent 1" w:uiPriority="46"/>
-    <w:lsdException w:name="List Table 2 Accent 1" w:uiPriority="47"/>
-    <w:lsdException w:name="List Table 3 Accent 1" w:uiPriority="48"/>
-    <w:lsdException w:name="List Table 4 Accent 1" w:uiPriority="49"/>
-    <w:lsdException w:name="List Table 5 Dark Accent 1" w:uiPriority="50"/>
-    <w:lsdException w:name="List Table 6 Colorful Accent 1" w:uiPriority="51"/>
-    <w:lsdException w:name="List Table 7 Colorful Accent 1" w:uiPriority="52"/>
-    <w:lsdException w:name="List Table 1 Light Accent 2" w:uiPriority="46"/>
-    <w:lsdException w:name="List Table 2 Accent 2" w:uiPriority="47"/>
-    <w:lsdException w:name="List Table 3 Accent 2" w:uiPriority="48"/>
-    <w:lsdException w:name="List Table 4 Accent 2" w:uiPriority="49"/>
-    <w:lsdException w:name="List Table 5 Dark Accent 2" w:uiPriority="50"/>
-    <w:lsdException w:name="List Table 6 Colorful Accent 2" w:uiPriority="51"/>
-    <w:lsdException w:name="List Table 7 Colorful Accent 2" w:uiPriority="52"/>
-    <w:lsdException w:name="List Table 1 Light Accent 3" w:uiPriority="46"/>
-    <w:lsdException w:name="List Table 2 Accent 3" w:uiPriority="47"/>
-    <w:lsdException w:name="List Table 3 Accent 3" w:uiPriority="48"/>
-    <w:lsdException w:name="List Table 4 Accent 3" w:uiPriority="49"/>
-    <w:lsdException w:name="List Table 5 Dark Accent 3" w:uiPriority="50"/>
-    <w:lsdException w:name="List Table 6 Colorful Accent 3" w:uiPriority="51"/>
-    <w:lsdException w:name="List Table 7 Colorful Accent 3" w:uiPriority="52"/>
-    <w:lsdException w:name="List Table 1 Light Accent 4" w:uiPriority="46"/>
-    <w:lsdException w:name="List Table 2 Accent 4" w:uiPriority="47"/>
-    <w:lsdException w:name="List Table 3 Accent 4" w:uiPriority="48"/>
-    <w:lsdException w:name="List Table 4 Accent 4" w:uiPriority="49"/>
-    <w:lsdException w:name="List Table 5 Dark Accent 4" w:uiPriority="50"/>
-    <w:lsdException w:name="List Table 6 Colorful Accent 4" w:uiPriority="51"/>
-    <w:lsdException w:name="List Table 7 Colorful Accent 4" w:uiPriority="52"/>
-    <w:lsdException w:name="List Table 1 Light Accent 5" w:uiPriority="46"/>
-    <w:lsdException w:name="List Table 2 Accent 5" w:uiPriority="47"/>
-    <w:lsdException w:name="List Table 3 Accent 5" w:uiPriority="48"/>
-    <w:lsdException w:name="List Table 4 Accent 5" w:uiPriority="49"/>
-    <w:lsdException w:name="List Table 5 Dark Accent 5" w:uiPriority="50"/>
-    <w:lsdException w:name="List Table 6 Colorful Accent 5" w:uiPriority="51"/>
-    <w:lsdException w:name="List Table 7 Colorful Accent 5" w:uiPriority="52"/>
-    <w:lsdException w:name="List Table 1 Light Accent 6" w:uiPriority="46"/>
-    <w:lsdException w:name="List Table 2 Accent 6" w:uiPriority="47"/>
-    <w:lsdException w:name="List Table 3 Accent 6" w:uiPriority="48"/>
-    <w:lsdException w:name="List Table 4 Accent 6" w:uiPriority="49"/>
-    <w:lsdException w:name="List Table 5 Dark Accent 6" w:uiPriority="50"/>
-    <w:lsdException w:name="List Table 6 Colorful Accent 6" w:uiPriority="51"/>
-    <w:lsdException w:name="List Table 7 Colorful Accent 6" w:uiPriority="52"/>
-  </w:latentStyles>
-  <w:style w:type="paragraph" w:default="1" w:styleId="Normal">
-    <w:name w:val="Normal"/>
-    <w:qFormat/>
-  </w:style>
-  <w:style w:type="character" w:default="1" w:styleId="Fuentedeprrafopredeter">
-    <w:name w:val="Default Paragraph Font"/>
-    <w:uiPriority w:val="1"/>
-    <w:semiHidden/>
-    <w:unhideWhenUsed/>
-  </w:style>
-  <w:style w:type="table" w:default="1" w:styleId="Tablanormal">
-    <w:name w:val="Normal Table"/>
-    <w:uiPriority w:val="99"/>
-    <w:semiHidden/>
-    <w:unhideWhenUsed/>
-    <w:tblPr>
-      <w:tblInd w:w="0" w:type="dxa"/>
-      <w:tblCellMar>
-        <w:top w:w="0" w:type="dxa"/>
-        <w:left w:w="108" w:type="dxa"/>
-        <w:bottom w:w="0" w:type="dxa"/>
-        <w:right w:w="108" w:type="dxa"/>
-      </w:tblCellMar>
-    </w:tblPr>
-  </w:style>
-  <w:style w:type="numbering" w:default="1" w:styleId="Sinlista">
-    <w:name w:val="No List"/>
-    <w:uiPriority w:val="99"/>
-    <w:semiHidden/>
-    <w:unhideWhenUsed/>
+  <w:style w:type="paragraph" w:customStyle="1" w:styleId="isselectedend">
+    <w:name w:val="isselectedend"/>
+    <w:basedOn w:val="Normal"/>
+    <w:rsid w:val="007F4228"/>
+    <w:pPr>
+      <w:spacing w:before="100" w:beforeAutospacing="1" w:after="100" w:afterAutospacing="1" w:line="240" w:lineRule="auto"/>
+    </w:pPr>
+    <w:rPr>
+      <w:rFonts w:ascii="Times New Roman" w:eastAsia="Times New Roman" w:hAnsi="Times New Roman" w:cs="Times New Roman"/>
+      <w:sz w:val="24"/>
+      <w:szCs w:val="24"/>
+      <w:lang w:eastAsia="es-CL"/>
+    </w:rPr>
   </w:style>
 </w:styles>
-</file>
-
-<file path=word/glossary/webSettings.xml><?xml version="1.0" encoding="utf-8"?>
-<w:webSettings xmlns:mc="http://schemas.openxmlformats.org/markup-compatibility/2006" xmlns:r="http://schemas.openxmlformats.org/officeDocument/2006/relationships" xmlns:w="http://schemas.openxmlformats.org/wordprocessingml/2006/main" xmlns:w14="http://schemas.microsoft.com/office/word/2010/wordml" xmlns:w15="http://schemas.microsoft.com/office/word/2012/wordml" xmlns:w16se="http://schemas.microsoft.com/office/word/2015/wordml/symex" mc:Ignorable="w14 w15 w16se"/>
 </file>
 
 <file path=word/theme/theme1.xml><?xml version="1.0" encoding="utf-8"?>
@@ -9929,12 +9616,9 @@
 </file>
 
 <file path=customXml/item1.xml><?xml version="1.0" encoding="utf-8"?>
-<?mso-contentType ?>
-<FormTemplates xmlns="http://schemas.microsoft.com/sharepoint/v3/contenttype/forms">
-  <Display>DocumentLibraryForm</Display>
-  <Edit>DocumentLibraryForm</Edit>
-  <New>DocumentLibraryForm</New>
-</FormTemplates>
+<p:properties xmlns:p="http://schemas.microsoft.com/office/2006/metadata/properties" xmlns:xsi="http://www.w3.org/2001/XMLSchema-instance" xmlns:pc="http://schemas.microsoft.com/office/infopath/2007/PartnerControls">
+  <documentManagement/>
+</p:properties>
 </file>
 
 <file path=customXml/item2.xml><?xml version="1.0" encoding="utf-8"?>
@@ -10070,9 +9754,12 @@
 </file>
 
 <file path=customXml/item3.xml><?xml version="1.0" encoding="utf-8"?>
-<p:properties xmlns:p="http://schemas.microsoft.com/office/2006/metadata/properties" xmlns:xsi="http://www.w3.org/2001/XMLSchema-instance" xmlns:pc="http://schemas.microsoft.com/office/infopath/2007/PartnerControls">
-  <documentManagement/>
-</p:properties>
+<?mso-contentType ?>
+<FormTemplates xmlns="http://schemas.microsoft.com/sharepoint/v3/contenttype/forms">
+  <Display>DocumentLibraryForm</Display>
+  <Edit>DocumentLibraryForm</Edit>
+  <New>DocumentLibraryForm</New>
+</FormTemplates>
 </file>
 
 <file path=customXml/item4.xml><?xml version="1.0" encoding="utf-8"?>
@@ -10080,9 +9767,10 @@
 </file>
 
 <file path=customXml/itemProps1.xml><?xml version="1.0" encoding="utf-8"?>
-<ds:datastoreItem xmlns:ds="http://schemas.openxmlformats.org/officeDocument/2006/customXml" ds:itemID="{DABAA964-10BA-4DBC-ABF2-CDEAC0FAF7AA}">
+<ds:datastoreItem xmlns:ds="http://schemas.openxmlformats.org/officeDocument/2006/customXml" ds:itemID="{5F1783E3-BA1C-4CA3-8E32-C9B378BBED03}">
   <ds:schemaRefs>
-    <ds:schemaRef ds:uri="http://schemas.microsoft.com/sharepoint/v3/contenttype/forms"/>
+    <ds:schemaRef ds:uri="http://schemas.microsoft.com/office/2006/metadata/properties"/>
+    <ds:schemaRef ds:uri="http://schemas.microsoft.com/office/infopath/2007/PartnerControls"/>
   </ds:schemaRefs>
 </ds:datastoreItem>
 </file>
@@ -10106,23 +9794,15 @@
 </file>
 
 <file path=customXml/itemProps3.xml><?xml version="1.0" encoding="utf-8"?>
-<ds:datastoreItem xmlns:ds="http://schemas.openxmlformats.org/officeDocument/2006/customXml" ds:itemID="{5F1783E3-BA1C-4CA3-8E32-C9B378BBED03}">
+<ds:datastoreItem xmlns:ds="http://schemas.openxmlformats.org/officeDocument/2006/customXml" ds:itemID="{DABAA964-10BA-4DBC-ABF2-CDEAC0FAF7AA}">
   <ds:schemaRefs>
-    <ds:schemaRef ds:uri="http://purl.org/dc/terms/"/>
-    <ds:schemaRef ds:uri="http://purl.org/dc/dcmitype/"/>
-    <ds:schemaRef ds:uri="http://schemas.microsoft.com/office/2006/metadata/properties"/>
-    <ds:schemaRef ds:uri="http://www.w3.org/XML/1998/namespace"/>
-    <ds:schemaRef ds:uri="http://schemas.microsoft.com/office/2006/documentManagement/types"/>
-    <ds:schemaRef ds:uri="126e8a1c-9ea9-435a-ac89-d06c80d62e30"/>
-    <ds:schemaRef ds:uri="http://purl.org/dc/elements/1.1/"/>
-    <ds:schemaRef ds:uri="http://schemas.microsoft.com/office/infopath/2007/PartnerControls"/>
-    <ds:schemaRef ds:uri="http://schemas.openxmlformats.org/package/2006/metadata/core-properties"/>
+    <ds:schemaRef ds:uri="http://schemas.microsoft.com/sharepoint/v3/contenttype/forms"/>
   </ds:schemaRefs>
 </ds:datastoreItem>
 </file>
 
 <file path=customXml/itemProps4.xml><?xml version="1.0" encoding="utf-8"?>
-<ds:datastoreItem xmlns:ds="http://schemas.openxmlformats.org/officeDocument/2006/customXml" ds:itemID="{38798A93-35BB-4E36-97F5-7254B21EAFCC}">
+<ds:datastoreItem xmlns:ds="http://schemas.openxmlformats.org/officeDocument/2006/customXml" ds:itemID="{A4066910-4593-4ED3-A200-2EDB218DA65C}">
   <ds:schemaRefs>
     <ds:schemaRef ds:uri="http://schemas.openxmlformats.org/officeDocument/2006/bibliography"/>
   </ds:schemaRefs>

</xml_diff>